<commit_message>
Updaing More Kernel examples
</commit_message>
<xml_diff>
--- a/Final_Report_SiliconMinds.docx
+++ b/Final_Report_SiliconMinds.docx
@@ -15,7 +15,7 @@
           <w:noProof/>
         </w:rPr>
         <w:drawing>
-          <wp:anchor distT="0" distB="0" distL="0" distR="0" simplePos="0" relativeHeight="251656704" behindDoc="1" locked="1" layoutInCell="1" allowOverlap="1" wp14:anchorId="28C69DBD" wp14:editId="25DDC00E">
+          <wp:anchor distT="0" distB="0" distL="0" distR="0" simplePos="0" relativeHeight="251649536" behindDoc="1" locked="1" layoutInCell="1" allowOverlap="1" wp14:anchorId="28C69DBD" wp14:editId="7E0C0CBF">
             <wp:simplePos x="0" y="0"/>
             <wp:positionH relativeFrom="page">
               <wp:posOffset>0</wp:posOffset>
@@ -777,7 +777,7 @@
           <w:color w:val="5B6478"/>
         </w:rPr>
       </w:pPr>
-      <w:hyperlink w:anchor="sec_outputgen">
+      <w:hyperlink w:anchor="_12._Output_generation">
         <w:r>
           <w:rPr>
             <w:rFonts w:asciiTheme="majorBidi" w:hAnsiTheme="majorBidi" w:cstheme="majorBidi"/>
@@ -815,7 +815,7 @@
           <w:rFonts w:asciiTheme="majorBidi" w:hAnsiTheme="majorBidi" w:cstheme="majorBidi"/>
         </w:rPr>
       </w:pPr>
-      <w:hyperlink w:anchor="sec_team">
+      <w:hyperlink w:anchor="_13._Team_and">
         <w:r>
           <w:rPr>
             <w:rFonts w:asciiTheme="majorBidi" w:hAnsiTheme="majorBidi" w:cstheme="majorBidi"/>
@@ -840,7 +840,15 @@
           <w:color w:val="5B6478"/>
           <w:rtl/>
         </w:rPr>
-        <w:t>18</w:t>
+        <w:t>1</w:t>
+      </w:r>
+      <w:r>
+        <w:rPr>
+          <w:rFonts w:asciiTheme="majorBidi" w:hAnsiTheme="majorBidi" w:cstheme="majorBidi"/>
+          <w:b/>
+          <w:color w:val="5B6478"/>
+        </w:rPr>
+        <w:t>9</w:t>
       </w:r>
     </w:p>
     <w:p>
@@ -855,7 +863,7 @@
           <w:color w:val="5B6478"/>
         </w:rPr>
       </w:pPr>
-      <w:hyperlink w:anchor="sec_reqtable">
+      <w:hyperlink w:anchor="_14._Competition_Required">
         <w:r>
           <w:rPr>
             <w:rFonts w:asciiTheme="majorBidi" w:hAnsiTheme="majorBidi" w:cstheme="majorBidi"/>
@@ -875,12 +883,11 @@
       </w:r>
       <w:r>
         <w:rPr>
-          <w:rFonts w:asciiTheme="majorBidi" w:hAnsiTheme="majorBidi" w:cstheme="majorBidi" w:hint="cs"/>
+          <w:rFonts w:asciiTheme="majorBidi" w:hAnsiTheme="majorBidi" w:cstheme="majorBidi"/>
           <w:b/>
           <w:color w:val="5B6478"/>
-          <w:rtl/>
-        </w:rPr>
-        <w:t>19</w:t>
+        </w:rPr>
+        <w:t>20</w:t>
       </w:r>
     </w:p>
     <w:p>
@@ -1245,7 +1252,7 @@
         <mc:AlternateContent>
           <mc:Choice Requires="wps">
             <w:drawing>
-              <wp:anchor distT="0" distB="0" distL="114300" distR="114300" simplePos="0" relativeHeight="251658752" behindDoc="1" locked="0" layoutInCell="1" allowOverlap="1" wp14:anchorId="51830645" wp14:editId="53B1C177">
+              <wp:anchor distT="0" distB="0" distL="114300" distR="114300" simplePos="0" relativeHeight="251653120" behindDoc="1" locked="0" layoutInCell="1" allowOverlap="1" wp14:anchorId="51830645" wp14:editId="75DD50CE">
                 <wp:simplePos x="0" y="0"/>
                 <wp:positionH relativeFrom="column">
                   <wp:posOffset>907415</wp:posOffset>
@@ -1326,7 +1333,7 @@
                 <v:stroke joinstyle="miter"/>
                 <v:path gradientshapeok="t" o:connecttype="rect"/>
               </v:shapetype>
-              <v:shape id="Text Box 1" o:spid="_x0000_s1026" type="#_x0000_t202" style="position:absolute;left:0;text-align:left;margin-left:71.45pt;margin-top:161.4pt;width:370.05pt;height:.05pt;z-index:-251657728;visibility:visible;mso-wrap-style:square;mso-wrap-distance-left:9pt;mso-wrap-distance-top:0;mso-wrap-distance-right:9pt;mso-wrap-distance-bottom:0;mso-position-horizontal:absolute;mso-position-horizontal-relative:text;mso-position-vertical:absolute;mso-position-vertical-relative:text;v-text-anchor:top" o:gfxdata="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" stroked="f">
+              <v:shape id="Text Box 1" o:spid="_x0000_s1026" type="#_x0000_t202" style="position:absolute;left:0;text-align:left;margin-left:71.45pt;margin-top:161.4pt;width:370.05pt;height:.05pt;z-index:-251663360;visibility:visible;mso-wrap-style:square;mso-wrap-distance-left:9pt;mso-wrap-distance-top:0;mso-wrap-distance-right:9pt;mso-wrap-distance-bottom:0;mso-position-horizontal:absolute;mso-position-horizontal-relative:text;mso-position-vertical:absolute;mso-position-vertical-relative:text;v-text-anchor:top" o:gfxdata="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" stroked="f">
                 <v:textbox style="mso-fit-shape-to-text:t" inset="0,0,0,0">
                   <w:txbxContent>
                     <w:p>
@@ -1369,7 +1376,7 @@
           <w:noProof/>
         </w:rPr>
         <w:drawing>
-          <wp:anchor distT="0" distB="0" distL="114300" distR="114300" simplePos="0" relativeHeight="251645952" behindDoc="1" locked="0" layoutInCell="1" allowOverlap="1" wp14:anchorId="3FC64956" wp14:editId="5D8DC5E3">
+          <wp:anchor distT="0" distB="0" distL="114300" distR="114300" simplePos="0" relativeHeight="251621376" behindDoc="1" locked="0" layoutInCell="1" allowOverlap="1" wp14:anchorId="3FC64956" wp14:editId="26C34766">
             <wp:simplePos x="0" y="0"/>
             <wp:positionH relativeFrom="column">
               <wp:posOffset>907415</wp:posOffset>
@@ -2991,7 +2998,7 @@
         <mc:AlternateContent>
           <mc:Choice Requires="wps">
             <w:drawing>
-              <wp:anchor distT="0" distB="0" distL="114300" distR="114300" simplePos="0" relativeHeight="251654144" behindDoc="1" locked="0" layoutInCell="1" allowOverlap="1" wp14:anchorId="29156C03" wp14:editId="471D8CDC">
+              <wp:anchor distT="0" distB="0" distL="114300" distR="114300" simplePos="0" relativeHeight="251633664" behindDoc="1" locked="0" layoutInCell="1" allowOverlap="1" wp14:anchorId="29156C03" wp14:editId="3DA85685">
                 <wp:simplePos x="0" y="0"/>
                 <wp:positionH relativeFrom="column">
                   <wp:posOffset>4046855</wp:posOffset>
@@ -3075,7 +3082,7 @@
           </mc:Choice>
           <mc:Fallback>
             <w:pict>
-              <v:shape w14:anchorId="29156C03" id="_x0000_s1027" type="#_x0000_t202" style="position:absolute;margin-left:318.65pt;margin-top:456.55pt;width:223.6pt;height:.05pt;z-index:-251662336;visibility:visible;mso-wrap-style:square;mso-wrap-distance-left:9pt;mso-wrap-distance-top:0;mso-wrap-distance-right:9pt;mso-wrap-distance-bottom:0;mso-position-horizontal:absolute;mso-position-horizontal-relative:text;mso-position-vertical:absolute;mso-position-vertical-relative:text;v-text-anchor:top" o:gfxdata="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" stroked="f">
+              <v:shape w14:anchorId="29156C03" id="_x0000_s1027" type="#_x0000_t202" style="position:absolute;margin-left:318.65pt;margin-top:456.55pt;width:223.6pt;height:.05pt;z-index:-251682816;visibility:visible;mso-wrap-style:square;mso-wrap-distance-left:9pt;mso-wrap-distance-top:0;mso-wrap-distance-right:9pt;mso-wrap-distance-bottom:0;mso-position-horizontal:absolute;mso-position-horizontal-relative:text;mso-position-vertical:absolute;mso-position-vertical-relative:text;v-text-anchor:top" o:gfxdata="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" stroked="f">
                 <v:textbox style="mso-fit-shape-to-text:t" inset="0,0,0,0">
                   <w:txbxContent>
                     <w:p>
@@ -3119,7 +3126,7 @@
           <w:noProof/>
         </w:rPr>
         <w:drawing>
-          <wp:anchor distT="0" distB="0" distL="114300" distR="114300" simplePos="0" relativeHeight="251651072" behindDoc="1" locked="0" layoutInCell="1" allowOverlap="1" wp14:anchorId="1DA8A552" wp14:editId="22ED88B5">
+          <wp:anchor distT="0" distB="0" distL="114300" distR="114300" simplePos="0" relativeHeight="251624448" behindDoc="1" locked="0" layoutInCell="1" allowOverlap="1" wp14:anchorId="1DA8A552" wp14:editId="2C96EE46">
             <wp:simplePos x="0" y="0"/>
             <wp:positionH relativeFrom="column">
               <wp:posOffset>4046855</wp:posOffset>
@@ -3161,7 +3168,7 @@
         <mc:AlternateContent>
           <mc:Choice Requires="wps">
             <w:drawing>
-              <wp:anchor distT="0" distB="0" distL="114300" distR="114300" simplePos="0" relativeHeight="251653120" behindDoc="0" locked="0" layoutInCell="1" allowOverlap="1" wp14:anchorId="3B9F3D40" wp14:editId="0DA2492B">
+              <wp:anchor distT="0" distB="0" distL="114300" distR="114300" simplePos="0" relativeHeight="251627520" behindDoc="0" locked="0" layoutInCell="1" allowOverlap="1" wp14:anchorId="3B9F3D40" wp14:editId="353FB238">
                 <wp:simplePos x="0" y="0"/>
                 <wp:positionH relativeFrom="column">
                   <wp:posOffset>4033520</wp:posOffset>
@@ -3238,7 +3245,7 @@
           </mc:Choice>
           <mc:Fallback>
             <w:pict>
-              <v:shape w14:anchorId="3B9F3D40" id="_x0000_s1028" type="#_x0000_t202" style="position:absolute;margin-left:317.6pt;margin-top:249.95pt;width:223.6pt;height:.05pt;z-index:251653120;visibility:visible;mso-wrap-style:square;mso-wrap-distance-left:9pt;mso-wrap-distance-top:0;mso-wrap-distance-right:9pt;mso-wrap-distance-bottom:0;mso-position-horizontal:absolute;mso-position-horizontal-relative:text;mso-position-vertical:absolute;mso-position-vertical-relative:text;v-text-anchor:top" o:gfxdata="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" stroked="f">
+              <v:shape w14:anchorId="3B9F3D40" id="_x0000_s1028" type="#_x0000_t202" style="position:absolute;margin-left:317.6pt;margin-top:249.95pt;width:223.6pt;height:.05pt;z-index:251627520;visibility:visible;mso-wrap-style:square;mso-wrap-distance-left:9pt;mso-wrap-distance-top:0;mso-wrap-distance-right:9pt;mso-wrap-distance-bottom:0;mso-position-horizontal:absolute;mso-position-horizontal-relative:text;mso-position-vertical:absolute;mso-position-vertical-relative:text;v-text-anchor:top" o:gfxdata="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" stroked="f">
                 <v:textbox style="mso-fit-shape-to-text:t" inset="0,0,0,0">
                   <w:txbxContent>
                     <w:p>
@@ -3282,7 +3289,7 @@
           <w:noProof/>
         </w:rPr>
         <w:drawing>
-          <wp:anchor distT="0" distB="0" distL="114300" distR="114300" simplePos="0" relativeHeight="251658240" behindDoc="0" locked="0" layoutInCell="1" allowOverlap="1" wp14:anchorId="7DF8E22C" wp14:editId="6557E17F">
+          <wp:anchor distT="0" distB="0" distL="114300" distR="114300" simplePos="0" relativeHeight="251636736" behindDoc="0" locked="0" layoutInCell="1" allowOverlap="1" wp14:anchorId="7DF8E22C" wp14:editId="2F51F2D3">
             <wp:simplePos x="0" y="0"/>
             <wp:positionH relativeFrom="column">
               <wp:posOffset>4033520</wp:posOffset>
@@ -3316,7 +3323,7 @@
         <mc:AlternateContent>
           <mc:Choice Requires="wps">
             <w:drawing>
-              <wp:anchor distT="0" distB="0" distL="114300" distR="114300" simplePos="0" relativeHeight="251704320" behindDoc="0" locked="0" layoutInCell="1" allowOverlap="1" wp14:anchorId="5ACF2BC6" wp14:editId="404242CD">
+              <wp:anchor distT="0" distB="0" distL="114300" distR="114300" simplePos="0" relativeHeight="251677696" behindDoc="0" locked="0" layoutInCell="1" allowOverlap="1" wp14:anchorId="5ACF2BC6" wp14:editId="5D1B15D9">
                 <wp:simplePos x="0" y="0"/>
                 <wp:positionH relativeFrom="column">
                   <wp:posOffset>1905</wp:posOffset>
@@ -3393,7 +3400,7 @@
           </mc:Choice>
           <mc:Fallback>
             <w:pict>
-              <v:shape w14:anchorId="5ACF2BC6" id="_x0000_s1029" type="#_x0000_t202" style="position:absolute;margin-left:.15pt;margin-top:249.4pt;width:310.35pt;height:.05pt;z-index:251704320;visibility:visible;mso-wrap-style:square;mso-wrap-distance-left:9pt;mso-wrap-distance-top:0;mso-wrap-distance-right:9pt;mso-wrap-distance-bottom:0;mso-position-horizontal:absolute;mso-position-horizontal-relative:text;mso-position-vertical:absolute;mso-position-vertical-relative:text;v-text-anchor:top" o:gfxdata="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" stroked="f">
+              <v:shape w14:anchorId="5ACF2BC6" id="_x0000_s1029" type="#_x0000_t202" style="position:absolute;margin-left:.15pt;margin-top:249.4pt;width:310.35pt;height:.05pt;z-index:251677696;visibility:visible;mso-wrap-style:square;mso-wrap-distance-left:9pt;mso-wrap-distance-top:0;mso-wrap-distance-right:9pt;mso-wrap-distance-bottom:0;mso-position-horizontal:absolute;mso-position-horizontal-relative:text;mso-position-vertical:absolute;mso-position-vertical-relative:text;v-text-anchor:top" o:gfxdata="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" stroked="f">
                 <v:textbox style="mso-fit-shape-to-text:t" inset="0,0,0,0">
                   <w:txbxContent>
                     <w:p>
@@ -3437,7 +3444,7 @@
           <w:noProof/>
         </w:rPr>
         <w:drawing>
-          <wp:anchor distT="0" distB="0" distL="114300" distR="114300" simplePos="0" relativeHeight="251664384" behindDoc="0" locked="0" layoutInCell="1" allowOverlap="1" wp14:anchorId="553433DC" wp14:editId="7772BB38">
+          <wp:anchor distT="0" distB="0" distL="114300" distR="114300" simplePos="0" relativeHeight="251662336" behindDoc="0" locked="0" layoutInCell="1" allowOverlap="1" wp14:anchorId="553433DC" wp14:editId="0BB8B244">
             <wp:simplePos x="0" y="0"/>
             <wp:positionH relativeFrom="column">
               <wp:posOffset>1905</wp:posOffset>
@@ -3880,7 +3887,7 @@
         <mc:AlternateContent>
           <mc:Choice Requires="wps">
             <w:drawing>
-              <wp:anchor distT="0" distB="0" distL="114300" distR="114300" simplePos="0" relativeHeight="251709440" behindDoc="1" locked="0" layoutInCell="1" allowOverlap="1" wp14:anchorId="095A2646" wp14:editId="49099261">
+              <wp:anchor distT="0" distB="0" distL="114300" distR="114300" simplePos="0" relativeHeight="251680768" behindDoc="1" locked="0" layoutInCell="1" allowOverlap="1" wp14:anchorId="095A2646" wp14:editId="732208A9">
                 <wp:simplePos x="0" y="0"/>
                 <wp:positionH relativeFrom="column">
                   <wp:posOffset>3761855</wp:posOffset>
@@ -3971,7 +3978,7 @@
           </mc:Choice>
           <mc:Fallback>
             <w:pict>
-              <v:shape w14:anchorId="095A2646" id="_x0000_s1030" type="#_x0000_t202" style="position:absolute;margin-left:296.2pt;margin-top:170.6pt;width:121.85pt;height:13.6pt;z-index:-251607040;visibility:visible;mso-wrap-style:square;mso-width-percent:0;mso-height-percent:0;mso-wrap-distance-left:9pt;mso-wrap-distance-top:0;mso-wrap-distance-right:9pt;mso-wrap-distance-bottom:0;mso-position-horizontal:absolute;mso-position-horizontal-relative:text;mso-position-vertical:absolute;mso-position-vertical-relative:text;mso-width-percent:0;mso-height-percent:0;mso-width-relative:margin;mso-height-relative:margin;v-text-anchor:top" o:gfxdata="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" stroked="f">
+              <v:shape w14:anchorId="095A2646" id="_x0000_s1030" type="#_x0000_t202" style="position:absolute;margin-left:296.2pt;margin-top:170.6pt;width:121.85pt;height:13.6pt;z-index:-251635712;visibility:visible;mso-wrap-style:square;mso-width-percent:0;mso-height-percent:0;mso-wrap-distance-left:9pt;mso-wrap-distance-top:0;mso-wrap-distance-right:9pt;mso-wrap-distance-bottom:0;mso-position-horizontal:absolute;mso-position-horizontal-relative:text;mso-position-vertical:absolute;mso-position-vertical-relative:text;mso-width-percent:0;mso-height-percent:0;mso-width-relative:margin;mso-height-relative:margin;v-text-anchor:top" o:gfxdata="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" stroked="f">
                 <v:textbox inset="0,0,0,0">
                   <w:txbxContent>
                     <w:p>
@@ -4015,7 +4022,7 @@
           <w:noProof/>
         </w:rPr>
         <w:drawing>
-          <wp:anchor distT="0" distB="0" distL="114300" distR="114300" simplePos="0" relativeHeight="251683840" behindDoc="1" locked="0" layoutInCell="1" allowOverlap="1" wp14:anchorId="31CF039F" wp14:editId="07855DBD">
+          <wp:anchor distT="0" distB="0" distL="114300" distR="114300" simplePos="0" relativeHeight="251668480" behindDoc="1" locked="0" layoutInCell="1" allowOverlap="1" wp14:anchorId="31CF039F" wp14:editId="380E90D6">
             <wp:simplePos x="0" y="0"/>
             <wp:positionH relativeFrom="column">
               <wp:posOffset>1518920</wp:posOffset>
@@ -4362,7 +4369,7 @@
         <mc:AlternateContent>
           <mc:Choice Requires="wps">
             <w:drawing>
-              <wp:anchor distT="0" distB="0" distL="114300" distR="114300" simplePos="0" relativeHeight="251660288" behindDoc="1" locked="0" layoutInCell="1" allowOverlap="1" wp14:anchorId="43EB2508" wp14:editId="4CAA8222">
+              <wp:anchor distT="0" distB="0" distL="114300" distR="114300" simplePos="0" relativeHeight="251656192" behindDoc="1" locked="0" layoutInCell="1" allowOverlap="1" wp14:anchorId="43EB2508" wp14:editId="4671EBF7">
                 <wp:simplePos x="0" y="0"/>
                 <wp:positionH relativeFrom="column">
                   <wp:posOffset>1951990</wp:posOffset>
@@ -4439,7 +4446,7 @@
           </mc:Choice>
           <mc:Fallback>
             <w:pict>
-              <v:shape w14:anchorId="43EB2508" id="_x0000_s1031" type="#_x0000_t202" style="position:absolute;margin-left:153.7pt;margin-top:301.25pt;width:351pt;height:.05pt;z-index:-251656192;visibility:visible;mso-wrap-style:square;mso-wrap-distance-left:9pt;mso-wrap-distance-top:0;mso-wrap-distance-right:9pt;mso-wrap-distance-bottom:0;mso-position-horizontal:absolute;mso-position-horizontal-relative:text;mso-position-vertical:absolute;mso-position-vertical-relative:text;v-text-anchor:top" o:gfxdata="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" stroked="f">
+              <v:shape w14:anchorId="43EB2508" id="_x0000_s1031" type="#_x0000_t202" style="position:absolute;margin-left:153.7pt;margin-top:301.25pt;width:351pt;height:.05pt;z-index:-251660288;visibility:visible;mso-wrap-style:square;mso-wrap-distance-left:9pt;mso-wrap-distance-top:0;mso-wrap-distance-right:9pt;mso-wrap-distance-bottom:0;mso-position-horizontal:absolute;mso-position-horizontal-relative:text;mso-position-vertical:absolute;mso-position-vertical-relative:text;v-text-anchor:top" o:gfxdata="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" stroked="f">
                 <v:textbox style="mso-fit-shape-to-text:t" inset="0,0,0,0">
                   <w:txbxContent>
                     <w:p>
@@ -4478,7 +4485,7 @@
           <w:lang w:val="ar-EG" w:bidi="ar-EG"/>
         </w:rPr>
         <w:drawing>
-          <wp:anchor distT="0" distB="0" distL="114300" distR="114300" simplePos="0" relativeHeight="251641856" behindDoc="1" locked="0" layoutInCell="1" allowOverlap="1" wp14:anchorId="1A1A84CB" wp14:editId="5519E5B2">
+          <wp:anchor distT="0" distB="0" distL="114300" distR="114300" simplePos="0" relativeHeight="251618304" behindDoc="1" locked="0" layoutInCell="1" allowOverlap="1" wp14:anchorId="1A1A84CB" wp14:editId="02879748">
             <wp:simplePos x="0" y="0"/>
             <wp:positionH relativeFrom="column">
               <wp:posOffset>1951990</wp:posOffset>
@@ -5182,7 +5189,7 @@
         <mc:AlternateContent>
           <mc:Choice Requires="wps">
             <w:drawing>
-              <wp:anchor distT="0" distB="0" distL="114300" distR="114300" simplePos="0" relativeHeight="251686912" behindDoc="1" locked="0" layoutInCell="1" allowOverlap="1" wp14:anchorId="0160D3EC" wp14:editId="178D6CE9">
+              <wp:anchor distT="0" distB="0" distL="114300" distR="114300" simplePos="0" relativeHeight="251671552" behindDoc="1" locked="0" layoutInCell="1" allowOverlap="1" wp14:anchorId="0160D3EC" wp14:editId="21D73FB4">
                 <wp:simplePos x="0" y="0"/>
                 <wp:positionH relativeFrom="column">
                   <wp:posOffset>3756025</wp:posOffset>
@@ -5269,7 +5276,7 @@
           </mc:Choice>
           <mc:Fallback>
             <w:pict>
-              <v:shape w14:anchorId="0160D3EC" id="_x0000_s1032" type="#_x0000_t202" style="position:absolute;margin-left:295.75pt;margin-top:197.3pt;width:241.8pt;height:10pt;z-index:-251629568;visibility:visible;mso-wrap-style:square;mso-height-percent:0;mso-wrap-distance-left:9pt;mso-wrap-distance-top:0;mso-wrap-distance-right:9pt;mso-wrap-distance-bottom:0;mso-position-horizontal:absolute;mso-position-horizontal-relative:text;mso-position-vertical:absolute;mso-position-vertical-relative:text;mso-height-percent:0;mso-height-relative:margin;v-text-anchor:top" o:gfxdata="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" stroked="f">
+              <v:shape w14:anchorId="0160D3EC" id="_x0000_s1032" type="#_x0000_t202" style="position:absolute;margin-left:295.75pt;margin-top:197.3pt;width:241.8pt;height:10pt;z-index:-251644928;visibility:visible;mso-wrap-style:square;mso-height-percent:0;mso-wrap-distance-left:9pt;mso-wrap-distance-top:0;mso-wrap-distance-right:9pt;mso-wrap-distance-bottom:0;mso-position-horizontal:absolute;mso-position-horizontal-relative:text;mso-position-vertical:absolute;mso-position-vertical-relative:text;mso-height-percent:0;mso-height-relative:margin;v-text-anchor:top" o:gfxdata="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" stroked="f">
                 <v:textbox inset="0,0,0,0">
                   <w:txbxContent>
                     <w:p>
@@ -5313,7 +5320,7 @@
           <w:lang w:bidi="ar-EG"/>
         </w:rPr>
         <w:drawing>
-          <wp:anchor distT="0" distB="0" distL="114300" distR="114300" simplePos="0" relativeHeight="251654144" behindDoc="1" locked="0" layoutInCell="1" allowOverlap="1" wp14:anchorId="2A9C118F" wp14:editId="66564B23">
+          <wp:anchor distT="0" distB="0" distL="114300" distR="114300" simplePos="0" relativeHeight="251630592" behindDoc="1" locked="0" layoutInCell="1" allowOverlap="1" wp14:anchorId="2A9C118F" wp14:editId="67A4F06C">
             <wp:simplePos x="0" y="0"/>
             <wp:positionH relativeFrom="column">
               <wp:posOffset>3759200</wp:posOffset>
@@ -5377,7 +5384,7 @@
         <mc:AlternateContent>
           <mc:Choice Requires="wps">
             <w:drawing>
-              <wp:anchor distT="0" distB="0" distL="114300" distR="114300" simplePos="0" relativeHeight="251672576" behindDoc="1" locked="0" layoutInCell="1" allowOverlap="1" wp14:anchorId="64C7C4EF" wp14:editId="4A70D989">
+              <wp:anchor distT="0" distB="0" distL="114300" distR="114300" simplePos="0" relativeHeight="251665408" behindDoc="1" locked="0" layoutInCell="1" allowOverlap="1" wp14:anchorId="64C7C4EF" wp14:editId="479B9E23">
                 <wp:simplePos x="0" y="0"/>
                 <wp:positionH relativeFrom="column">
                   <wp:posOffset>-338455</wp:posOffset>
@@ -5466,7 +5473,7 @@
           </mc:Choice>
           <mc:Fallback>
             <w:pict>
-              <v:shape w14:anchorId="64C7C4EF" id="_x0000_s1033" type="#_x0000_t202" style="position:absolute;margin-left:-26.65pt;margin-top:198.1pt;width:320.55pt;height:11.6pt;z-index:-251643904;visibility:visible;mso-wrap-style:square;mso-height-percent:0;mso-wrap-distance-left:9pt;mso-wrap-distance-top:0;mso-wrap-distance-right:9pt;mso-wrap-distance-bottom:0;mso-position-horizontal:absolute;mso-position-horizontal-relative:text;mso-position-vertical:absolute;mso-position-vertical-relative:text;mso-height-percent:0;mso-height-relative:margin;v-text-anchor:top" o:gfxdata="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" stroked="f">
+              <v:shape w14:anchorId="64C7C4EF" id="_x0000_s1033" type="#_x0000_t202" style="position:absolute;margin-left:-26.65pt;margin-top:198.1pt;width:320.55pt;height:11.6pt;z-index:-251651072;visibility:visible;mso-wrap-style:square;mso-height-percent:0;mso-wrap-distance-left:9pt;mso-wrap-distance-top:0;mso-wrap-distance-right:9pt;mso-wrap-distance-bottom:0;mso-position-horizontal:absolute;mso-position-horizontal-relative:text;mso-position-vertical:absolute;mso-position-vertical-relative:text;mso-height-percent:0;mso-height-relative:margin;v-text-anchor:top" o:gfxdata="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" stroked="f">
                 <v:textbox inset="0,0,0,0">
                   <w:txbxContent>
                     <w:p>
@@ -5512,7 +5519,7 @@
           <w:lang w:bidi="ar-EG"/>
         </w:rPr>
         <w:drawing>
-          <wp:anchor distT="0" distB="0" distL="114300" distR="114300" simplePos="0" relativeHeight="251639808" behindDoc="1" locked="0" layoutInCell="1" allowOverlap="1" wp14:anchorId="0FAED5EA" wp14:editId="7FEB34C8">
+          <wp:anchor distT="0" distB="0" distL="114300" distR="114300" simplePos="0" relativeHeight="251615232" behindDoc="1" locked="0" layoutInCell="1" allowOverlap="1" wp14:anchorId="0FAED5EA" wp14:editId="2E9E1B3C">
             <wp:simplePos x="0" y="0"/>
             <wp:positionH relativeFrom="column">
               <wp:posOffset>-337820</wp:posOffset>
@@ -5576,7 +5583,7 @@
         <mc:AlternateContent>
           <mc:Choice Requires="wps">
             <w:drawing>
-              <wp:anchor distT="0" distB="0" distL="114300" distR="114300" simplePos="0" relativeHeight="251715584" behindDoc="1" locked="0" layoutInCell="1" allowOverlap="1" wp14:anchorId="53A26CAD" wp14:editId="1AD76CC4">
+              <wp:anchor distT="0" distB="0" distL="114300" distR="114300" simplePos="0" relativeHeight="251683840" behindDoc="1" locked="0" layoutInCell="1" allowOverlap="1" wp14:anchorId="53A26CAD" wp14:editId="239DE9F4">
                 <wp:simplePos x="0" y="0"/>
                 <wp:positionH relativeFrom="column">
                   <wp:posOffset>862965</wp:posOffset>
@@ -5659,7 +5666,7 @@
           </mc:Choice>
           <mc:Fallback>
             <w:pict>
-              <v:shape w14:anchorId="53A26CAD" id="_x0000_s1034" type="#_x0000_t202" style="position:absolute;margin-left:67.95pt;margin-top:385.55pt;width:464.2pt;height:.05pt;z-index:-251600896;visibility:visible;mso-wrap-style:square;mso-wrap-distance-left:9pt;mso-wrap-distance-top:0;mso-wrap-distance-right:9pt;mso-wrap-distance-bottom:0;mso-position-horizontal:absolute;mso-position-horizontal-relative:text;mso-position-vertical:absolute;mso-position-vertical-relative:text;v-text-anchor:top" o:gfxdata="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" stroked="f">
+              <v:shape w14:anchorId="53A26CAD" id="_x0000_s1034" type="#_x0000_t202" style="position:absolute;margin-left:67.95pt;margin-top:385.55pt;width:464.2pt;height:.05pt;z-index:-251632640;visibility:visible;mso-wrap-style:square;mso-wrap-distance-left:9pt;mso-wrap-distance-top:0;mso-wrap-distance-right:9pt;mso-wrap-distance-bottom:0;mso-position-horizontal:absolute;mso-position-horizontal-relative:text;mso-position-vertical:absolute;mso-position-vertical-relative:text;v-text-anchor:top" o:gfxdata="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" stroked="f">
                 <v:textbox style="mso-fit-shape-to-text:t" inset="0,0,0,0">
                   <w:txbxContent>
                     <w:p>
@@ -5703,7 +5710,7 @@
           <w:lang w:bidi="ar-EG"/>
         </w:rPr>
         <w:drawing>
-          <wp:anchor distT="0" distB="0" distL="114300" distR="114300" simplePos="0" relativeHeight="251660288" behindDoc="1" locked="0" layoutInCell="1" allowOverlap="1" wp14:anchorId="72004D82" wp14:editId="567A2804">
+          <wp:anchor distT="0" distB="0" distL="114300" distR="114300" simplePos="0" relativeHeight="251659264" behindDoc="1" locked="0" layoutInCell="1" allowOverlap="1" wp14:anchorId="72004D82" wp14:editId="23F867F4">
             <wp:simplePos x="0" y="0"/>
             <wp:positionH relativeFrom="column">
               <wp:posOffset>862965</wp:posOffset>
@@ -8435,7 +8442,7 @@
         <mc:AlternateContent>
           <mc:Choice Requires="wps">
             <w:drawing>
-              <wp:anchor distT="0" distB="0" distL="114300" distR="114300" simplePos="0" relativeHeight="251717632" behindDoc="1" locked="0" layoutInCell="1" allowOverlap="1" wp14:anchorId="756BE312" wp14:editId="27063A8E">
+              <wp:anchor distT="0" distB="0" distL="114300" distR="114300" simplePos="0" relativeHeight="251702272" behindDoc="1" locked="0" layoutInCell="1" allowOverlap="1" wp14:anchorId="756BE312" wp14:editId="7C24F21B">
                 <wp:simplePos x="0" y="0"/>
                 <wp:positionH relativeFrom="column">
                   <wp:posOffset>2453640</wp:posOffset>
@@ -8523,7 +8530,7 @@
           </mc:Choice>
           <mc:Fallback>
             <w:pict>
-              <v:shape w14:anchorId="756BE312" id="_x0000_s1035" type="#_x0000_t202" style="position:absolute;margin-left:193.2pt;margin-top:597.05pt;width:328.35pt;height:.05pt;z-index:-251598848;visibility:visible;mso-wrap-style:square;mso-wrap-distance-left:9pt;mso-wrap-distance-top:0;mso-wrap-distance-right:9pt;mso-wrap-distance-bottom:0;mso-position-horizontal:absolute;mso-position-horizontal-relative:text;mso-position-vertical:absolute;mso-position-vertical-relative:text;v-text-anchor:top" o:gfxdata="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" stroked="f">
+              <v:shape w14:anchorId="756BE312" id="_x0000_s1035" type="#_x0000_t202" style="position:absolute;margin-left:193.2pt;margin-top:597.05pt;width:328.35pt;height:.05pt;z-index:-251614208;visibility:visible;mso-wrap-style:square;mso-wrap-distance-left:9pt;mso-wrap-distance-top:0;mso-wrap-distance-right:9pt;mso-wrap-distance-bottom:0;mso-position-horizontal:absolute;mso-position-horizontal-relative:text;mso-position-vertical:absolute;mso-position-vertical-relative:text;v-text-anchor:top" o:gfxdata="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" stroked="f">
                 <v:textbox style="mso-fit-shape-to-text:t" inset="0,0,0,0">
                   <w:txbxContent>
                     <w:p>
@@ -8570,7 +8577,7 @@
           <w:noProof/>
         </w:rPr>
         <w:drawing>
-          <wp:anchor distT="0" distB="0" distL="114300" distR="114300" simplePos="0" relativeHeight="251695104" behindDoc="1" locked="0" layoutInCell="1" allowOverlap="1" wp14:anchorId="7F40F73D" wp14:editId="2269E205">
+          <wp:anchor distT="0" distB="0" distL="114300" distR="114300" simplePos="0" relativeHeight="251674624" behindDoc="1" locked="0" layoutInCell="1" allowOverlap="1" wp14:anchorId="7F40F73D" wp14:editId="59B3ADB0">
             <wp:simplePos x="0" y="0"/>
             <wp:positionH relativeFrom="column">
               <wp:posOffset>2453813</wp:posOffset>
@@ -8664,6 +8671,8 @@
         <w:pStyle w:val="Heading1"/>
       </w:pPr>
       <w:bookmarkStart w:id="11" w:name="sec_outputgen"/>
+      <w:bookmarkStart w:id="12" w:name="_12._Output_generation"/>
+      <w:bookmarkEnd w:id="12"/>
       <w:r>
         <w:lastRenderedPageBreak/>
         <w:t>12. Output generation</w:t>
@@ -9343,16 +9352,223 @@
         <w:rPr>
           <w:noProof/>
         </w:rPr>
+        <w:drawing>
+          <wp:anchor distT="0" distB="0" distL="114300" distR="114300" simplePos="0" relativeHeight="251548672" behindDoc="1" locked="0" layoutInCell="1" allowOverlap="1" wp14:anchorId="2BA58FF7" wp14:editId="7C677863">
+            <wp:simplePos x="0" y="0"/>
+            <wp:positionH relativeFrom="column">
+              <wp:posOffset>2996565</wp:posOffset>
+            </wp:positionH>
+            <wp:positionV relativeFrom="paragraph">
+              <wp:posOffset>1089025</wp:posOffset>
+            </wp:positionV>
+            <wp:extent cx="2362200" cy="1770380"/>
+            <wp:effectExtent l="0" t="0" r="0" b="1270"/>
+            <wp:wrapTight wrapText="bothSides">
+              <wp:wrapPolygon edited="0">
+                <wp:start x="0" y="0"/>
+                <wp:lineTo x="0" y="21383"/>
+                <wp:lineTo x="21426" y="21383"/>
+                <wp:lineTo x="21426" y="0"/>
+                <wp:lineTo x="0" y="0"/>
+              </wp:wrapPolygon>
+            </wp:wrapTight>
+            <wp:docPr id="47539581" name="Picture 1"/>
+            <wp:cNvGraphicFramePr>
+              <a:graphicFrameLocks xmlns:a="http://schemas.openxmlformats.org/drawingml/2006/main" noChangeAspect="1"/>
+            </wp:cNvGraphicFramePr>
+            <a:graphic xmlns:a="http://schemas.openxmlformats.org/drawingml/2006/main">
+              <a:graphicData uri="http://schemas.openxmlformats.org/drawingml/2006/picture">
+                <pic:pic xmlns:pic="http://schemas.openxmlformats.org/drawingml/2006/picture">
+                  <pic:nvPicPr>
+                    <pic:cNvPr id="0" name="Picture 1"/>
+                    <pic:cNvPicPr>
+                      <a:picLocks noChangeAspect="1" noChangeArrowheads="1"/>
+                    </pic:cNvPicPr>
+                  </pic:nvPicPr>
+                  <pic:blipFill>
+                    <a:blip r:embed="rId32">
+                      <a:extLst>
+                        <a:ext uri="{28A0092B-C50C-407E-A947-70E740481C1C}">
+                          <a14:useLocalDpi xmlns:a14="http://schemas.microsoft.com/office/drawing/2010/main" val="0"/>
+                        </a:ext>
+                      </a:extLst>
+                    </a:blip>
+                    <a:srcRect/>
+                    <a:stretch>
+                      <a:fillRect/>
+                    </a:stretch>
+                  </pic:blipFill>
+                  <pic:spPr bwMode="auto">
+                    <a:xfrm>
+                      <a:off x="0" y="0"/>
+                      <a:ext cx="2362200" cy="1770380"/>
+                    </a:xfrm>
+                    <a:prstGeom prst="rect">
+                      <a:avLst/>
+                    </a:prstGeom>
+                    <a:noFill/>
+                    <a:ln>
+                      <a:noFill/>
+                    </a:ln>
+                  </pic:spPr>
+                </pic:pic>
+              </a:graphicData>
+            </a:graphic>
+            <wp14:sizeRelH relativeFrom="margin">
+              <wp14:pctWidth>0</wp14:pctWidth>
+            </wp14:sizeRelH>
+            <wp14:sizeRelV relativeFrom="margin">
+              <wp14:pctHeight>0</wp14:pctHeight>
+            </wp14:sizeRelV>
+          </wp:anchor>
+        </w:drawing>
+      </w:r>
+      <w:r>
+        <w:rPr>
+          <w:rFonts w:asciiTheme="majorBidi" w:hAnsiTheme="majorBidi" w:cstheme="majorBidi"/>
+        </w:rPr>
+        <w:t>For simulation, tb_top_2px.v dumps both result lanes to sim/rtl_output.mem in raster order; verify.py is the actual PASS/FAIL authority, comparing it word-for-word against the golden model. A numeric PASS is not the same as “looks right”, so mem_to_image.py separately renders that same file back into a viewable PNG (Images/rtl_output_preview.png) for a side-by-side visual sanity check against the source image - this is also how the coefficient-sign bug described in Section 11 was actually caught, since the golden-model comparison alone did not.</w:t>
+      </w:r>
+    </w:p>
+    <w:p>
+      <w:pPr>
+        <w:pStyle w:val="Heading2"/>
+      </w:pPr>
+      <w:r>
+        <w:t xml:space="preserve">12.1 Kernal </w:t>
+      </w:r>
+      <w:proofErr w:type="gramStart"/>
+      <w:r>
+        <w:t>( Horizontal</w:t>
+      </w:r>
+      <w:proofErr w:type="gramEnd"/>
+      <w:r>
+        <w:t xml:space="preserve"> </w:t>
+      </w:r>
+      <w:proofErr w:type="gramStart"/>
+      <w:r>
+        <w:t>Detection )</w:t>
+      </w:r>
+      <w:proofErr w:type="gramEnd"/>
+      <w:r>
+        <w:t>:</w:t>
+      </w:r>
+    </w:p>
+    <w:p>
+      <w:pPr>
+        <w:spacing w:after="160"/>
+        <w:rPr>
+          <w:rFonts w:asciiTheme="majorBidi" w:hAnsiTheme="majorBidi" w:cstheme="majorBidi"/>
+          <w:b/>
+          <w:bCs/>
+        </w:rPr>
+      </w:pPr>
+      <w:r>
+        <w:rPr>
+          <w:rStyle w:val="Heading2Char"/>
+        </w:rPr>
+        <w:br/>
+      </w:r>
+      <w:r>
+        <w:rPr>
+          <w:rFonts w:asciiTheme="majorBidi" w:hAnsiTheme="majorBidi" w:cstheme="majorBidi"/>
+          <w:b/>
+          <w:bCs/>
+        </w:rPr>
+        <w:br/>
+      </w:r>
+      <w:r>
+        <w:rPr>
+          <w:rFonts w:asciiTheme="majorBidi" w:hAnsiTheme="majorBidi" w:cstheme="majorBidi"/>
+          <w:b/>
+          <w:bCs/>
+        </w:rPr>
+        <w:t>[[-1, -2, -1],</w:t>
+      </w:r>
+    </w:p>
+    <w:p>
+      <w:pPr>
+        <w:spacing w:after="160"/>
+        <w:rPr>
+          <w:rFonts w:asciiTheme="majorBidi" w:hAnsiTheme="majorBidi" w:cstheme="majorBidi"/>
+          <w:b/>
+          <w:bCs/>
+        </w:rPr>
+      </w:pPr>
+      <w:proofErr w:type="gramStart"/>
+      <w:r>
+        <w:rPr>
+          <w:rFonts w:asciiTheme="majorBidi" w:hAnsiTheme="majorBidi" w:cstheme="majorBidi"/>
+          <w:b/>
+          <w:bCs/>
+        </w:rPr>
+        <w:t xml:space="preserve">[0, </w:t>
+      </w:r>
+      <w:proofErr w:type="gramEnd"/>
+      <w:r>
+        <w:rPr>
+          <w:rFonts w:asciiTheme="majorBidi" w:hAnsiTheme="majorBidi" w:cstheme="majorBidi"/>
+          <w:b/>
+          <w:bCs/>
+        </w:rPr>
+        <w:t>0, 0],</w:t>
+      </w:r>
+    </w:p>
+    <w:p>
+      <w:pPr>
+        <w:spacing w:after="160"/>
+        <w:rPr>
+          <w:rFonts w:asciiTheme="majorBidi" w:hAnsiTheme="majorBidi" w:cstheme="majorBidi"/>
+          <w:b/>
+          <w:bCs/>
+        </w:rPr>
+      </w:pPr>
+      <w:r>
+        <w:rPr>
+          <w:rFonts w:asciiTheme="majorBidi" w:hAnsiTheme="majorBidi" w:cstheme="majorBidi"/>
+          <w:b/>
+          <w:bCs/>
+        </w:rPr>
+        <w:t>[1, 2, 1]]</w:t>
+      </w:r>
+      <w:r>
+        <w:rPr>
+          <w:rFonts w:asciiTheme="majorBidi" w:hAnsiTheme="majorBidi" w:cstheme="majorBidi"/>
+          <w:b/>
+          <w:bCs/>
+        </w:rPr>
+        <w:t>,</w:t>
+      </w:r>
+      <w:r>
+        <w:rPr>
+          <w:rFonts w:asciiTheme="majorBidi" w:hAnsiTheme="majorBidi" w:cstheme="majorBidi"/>
+          <w:b/>
+          <w:bCs/>
+        </w:rPr>
+        <w:br/>
+      </w:r>
+    </w:p>
+    <w:p>
+      <w:pPr>
+        <w:spacing w:after="160"/>
+        <w:rPr>
+          <w:rFonts w:asciiTheme="majorBidi" w:hAnsiTheme="majorBidi" w:cstheme="majorBidi"/>
+        </w:rPr>
+      </w:pPr>
+      <w:r>
+        <w:rPr>
+          <w:noProof/>
+        </w:rPr>
         <mc:AlternateContent>
           <mc:Choice Requires="wps">
             <w:drawing>
-              <wp:anchor distT="0" distB="0" distL="114300" distR="114300" simplePos="0" relativeHeight="251701248" behindDoc="1" locked="0" layoutInCell="1" allowOverlap="1" wp14:anchorId="7A32721B" wp14:editId="5310A2CC">
+              <wp:anchor distT="0" distB="0" distL="114300" distR="114300" simplePos="0" relativeHeight="251553792" behindDoc="1" locked="0" layoutInCell="1" allowOverlap="1" wp14:anchorId="7A32721B" wp14:editId="28826D0C">
                 <wp:simplePos x="0" y="0"/>
                 <wp:positionH relativeFrom="column">
-                  <wp:posOffset>1937385</wp:posOffset>
+                  <wp:posOffset>2920365</wp:posOffset>
                 </wp:positionH>
                 <wp:positionV relativeFrom="paragraph">
-                  <wp:posOffset>2895600</wp:posOffset>
+                  <wp:posOffset>192405</wp:posOffset>
                 </wp:positionV>
                 <wp:extent cx="2362200" cy="635"/>
                 <wp:effectExtent l="0" t="0" r="0" b="0"/>
@@ -9429,7 +9645,7 @@
           </mc:Choice>
           <mc:Fallback>
             <w:pict>
-              <v:shape w14:anchorId="7A32721B" id="_x0000_s1036" type="#_x0000_t202" style="position:absolute;margin-left:152.55pt;margin-top:228pt;width:186pt;height:.05pt;z-index:-251615232;visibility:visible;mso-wrap-style:square;mso-wrap-distance-left:9pt;mso-wrap-distance-top:0;mso-wrap-distance-right:9pt;mso-wrap-distance-bottom:0;mso-position-horizontal:absolute;mso-position-horizontal-relative:text;mso-position-vertical:absolute;mso-position-vertical-relative:text;v-text-anchor:top" o:gfxdata="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" stroked="f">
+              <v:shape w14:anchorId="7A32721B" id="_x0000_s1036" type="#_x0000_t202" style="position:absolute;margin-left:229.95pt;margin-top:15.15pt;width:186pt;height:.05pt;z-index:-251762688;visibility:visible;mso-wrap-style:square;mso-wrap-distance-left:9pt;mso-wrap-distance-top:0;mso-wrap-distance-right:9pt;mso-wrap-distance-bottom:0;mso-position-horizontal:absolute;mso-position-horizontal-relative:text;mso-position-vertical:absolute;mso-position-vertical-relative:text;v-text-anchor:top" o:gfxdata="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" stroked="f">
                 <v:textbox style="mso-fit-shape-to-text:t" inset="0,0,0,0">
                   <w:txbxContent>
                     <w:p>
@@ -9466,135 +9682,6 @@
           </mc:Fallback>
         </mc:AlternateContent>
       </w:r>
-      <w:r>
-        <w:rPr>
-          <w:noProof/>
-        </w:rPr>
-        <w:drawing>
-          <wp:anchor distT="0" distB="0" distL="114300" distR="114300" simplePos="0" relativeHeight="251620352" behindDoc="1" locked="0" layoutInCell="1" allowOverlap="1" wp14:anchorId="2BA58FF7" wp14:editId="134F6549">
-            <wp:simplePos x="0" y="0"/>
-            <wp:positionH relativeFrom="column">
-              <wp:posOffset>1937385</wp:posOffset>
-            </wp:positionH>
-            <wp:positionV relativeFrom="paragraph">
-              <wp:posOffset>1068070</wp:posOffset>
-            </wp:positionV>
-            <wp:extent cx="2362200" cy="1770380"/>
-            <wp:effectExtent l="0" t="0" r="0" b="1270"/>
-            <wp:wrapTight wrapText="bothSides">
-              <wp:wrapPolygon edited="0">
-                <wp:start x="0" y="0"/>
-                <wp:lineTo x="0" y="21383"/>
-                <wp:lineTo x="21426" y="21383"/>
-                <wp:lineTo x="21426" y="0"/>
-                <wp:lineTo x="0" y="0"/>
-              </wp:wrapPolygon>
-            </wp:wrapTight>
-            <wp:docPr id="47539581" name="Picture 1"/>
-            <wp:cNvGraphicFramePr>
-              <a:graphicFrameLocks xmlns:a="http://schemas.openxmlformats.org/drawingml/2006/main" noChangeAspect="1"/>
-            </wp:cNvGraphicFramePr>
-            <a:graphic xmlns:a="http://schemas.openxmlformats.org/drawingml/2006/main">
-              <a:graphicData uri="http://schemas.openxmlformats.org/drawingml/2006/picture">
-                <pic:pic xmlns:pic="http://schemas.openxmlformats.org/drawingml/2006/picture">
-                  <pic:nvPicPr>
-                    <pic:cNvPr id="0" name="Picture 1"/>
-                    <pic:cNvPicPr>
-                      <a:picLocks noChangeAspect="1" noChangeArrowheads="1"/>
-                    </pic:cNvPicPr>
-                  </pic:nvPicPr>
-                  <pic:blipFill>
-                    <a:blip r:embed="rId32">
-                      <a:extLst>
-                        <a:ext uri="{28A0092B-C50C-407E-A947-70E740481C1C}">
-                          <a14:useLocalDpi xmlns:a14="http://schemas.microsoft.com/office/drawing/2010/main" val="0"/>
-                        </a:ext>
-                      </a:extLst>
-                    </a:blip>
-                    <a:srcRect/>
-                    <a:stretch>
-                      <a:fillRect/>
-                    </a:stretch>
-                  </pic:blipFill>
-                  <pic:spPr bwMode="auto">
-                    <a:xfrm>
-                      <a:off x="0" y="0"/>
-                      <a:ext cx="2362200" cy="1770380"/>
-                    </a:xfrm>
-                    <a:prstGeom prst="rect">
-                      <a:avLst/>
-                    </a:prstGeom>
-                    <a:noFill/>
-                    <a:ln>
-                      <a:noFill/>
-                    </a:ln>
-                  </pic:spPr>
-                </pic:pic>
-              </a:graphicData>
-            </a:graphic>
-            <wp14:sizeRelH relativeFrom="margin">
-              <wp14:pctWidth>0</wp14:pctWidth>
-            </wp14:sizeRelH>
-            <wp14:sizeRelV relativeFrom="margin">
-              <wp14:pctHeight>0</wp14:pctHeight>
-            </wp14:sizeRelV>
-          </wp:anchor>
-        </w:drawing>
-      </w:r>
-      <w:r>
-        <w:rPr>
-          <w:rFonts w:asciiTheme="majorBidi" w:hAnsiTheme="majorBidi" w:cstheme="majorBidi"/>
-        </w:rPr>
-        <w:t>For simulation, tb_top_2px.v dumps both result lanes to sim/rtl_output.mem in raster order; verify.py is the actual PASS/FAIL authority, comparing it word-for-word against the golden model. A numeric PASS is not the same as “looks right”, so mem_to_image.py separately renders that same file back into a viewable PNG (Images/rtl_output_preview.png) for a side-by-side visual sanity check against the source image - this is also how the coefficient-sign bug described in Section 11 was actually caught, since the golden-model comparison alone did not.</w:t>
-      </w:r>
-    </w:p>
-    <w:p>
-      <w:pPr>
-        <w:spacing w:after="160"/>
-        <w:rPr>
-          <w:rFonts w:asciiTheme="majorBidi" w:hAnsiTheme="majorBidi" w:cstheme="majorBidi"/>
-        </w:rPr>
-      </w:pPr>
-    </w:p>
-    <w:p>
-      <w:pPr>
-        <w:spacing w:after="160"/>
-        <w:rPr>
-          <w:rFonts w:asciiTheme="majorBidi" w:hAnsiTheme="majorBidi" w:cstheme="majorBidi"/>
-        </w:rPr>
-      </w:pPr>
-    </w:p>
-    <w:p>
-      <w:pPr>
-        <w:spacing w:after="160"/>
-        <w:rPr>
-          <w:rFonts w:asciiTheme="majorBidi" w:hAnsiTheme="majorBidi" w:cstheme="majorBidi"/>
-        </w:rPr>
-      </w:pPr>
-    </w:p>
-    <w:p>
-      <w:pPr>
-        <w:spacing w:after="160"/>
-        <w:rPr>
-          <w:rFonts w:asciiTheme="majorBidi" w:hAnsiTheme="majorBidi" w:cstheme="majorBidi"/>
-        </w:rPr>
-      </w:pPr>
-    </w:p>
-    <w:p>
-      <w:pPr>
-        <w:spacing w:after="160"/>
-        <w:rPr>
-          <w:rFonts w:asciiTheme="majorBidi" w:hAnsiTheme="majorBidi" w:cstheme="majorBidi"/>
-        </w:rPr>
-      </w:pPr>
-    </w:p>
-    <w:p>
-      <w:pPr>
-        <w:spacing w:after="160"/>
-        <w:rPr>
-          <w:rFonts w:asciiTheme="majorBidi" w:hAnsiTheme="majorBidi" w:cstheme="majorBidi"/>
-        </w:rPr>
-      </w:pPr>
     </w:p>
     <w:p>
       <w:pPr>
@@ -9665,6 +9752,1400 @@
       </w:fldSimple>
       <w:r>
         <w:t>: Output image</w:t>
+      </w:r>
+    </w:p>
+    <w:p>
+      <w:pPr>
+        <w:pStyle w:val="Heading2"/>
+      </w:pPr>
+      <w:r>
+        <w:rPr>
+          <w:noProof/>
+        </w:rPr>
+        <w:lastRenderedPageBreak/>
+        <w:drawing>
+          <wp:anchor distT="0" distB="0" distL="114300" distR="114300" simplePos="0" relativeHeight="251571200" behindDoc="1" locked="0" layoutInCell="1" allowOverlap="1" wp14:anchorId="4573C865" wp14:editId="1B7649C2">
+            <wp:simplePos x="0" y="0"/>
+            <wp:positionH relativeFrom="column">
+              <wp:posOffset>4017645</wp:posOffset>
+            </wp:positionH>
+            <wp:positionV relativeFrom="paragraph">
+              <wp:posOffset>219710</wp:posOffset>
+            </wp:positionV>
+            <wp:extent cx="2640330" cy="1979930"/>
+            <wp:effectExtent l="0" t="0" r="7620" b="1270"/>
+            <wp:wrapTight wrapText="bothSides">
+              <wp:wrapPolygon edited="0">
+                <wp:start x="0" y="0"/>
+                <wp:lineTo x="0" y="21406"/>
+                <wp:lineTo x="21506" y="21406"/>
+                <wp:lineTo x="21506" y="0"/>
+                <wp:lineTo x="0" y="0"/>
+              </wp:wrapPolygon>
+            </wp:wrapTight>
+            <wp:docPr id="890114788" name="Picture 14"/>
+            <wp:cNvGraphicFramePr>
+              <a:graphicFrameLocks xmlns:a="http://schemas.openxmlformats.org/drawingml/2006/main" noChangeAspect="1"/>
+            </wp:cNvGraphicFramePr>
+            <a:graphic xmlns:a="http://schemas.openxmlformats.org/drawingml/2006/main">
+              <a:graphicData uri="http://schemas.openxmlformats.org/drawingml/2006/picture">
+                <pic:pic xmlns:pic="http://schemas.openxmlformats.org/drawingml/2006/picture">
+                  <pic:nvPicPr>
+                    <pic:cNvPr id="0" name="Picture 6"/>
+                    <pic:cNvPicPr>
+                      <a:picLocks noChangeAspect="1" noChangeArrowheads="1"/>
+                    </pic:cNvPicPr>
+                  </pic:nvPicPr>
+                  <pic:blipFill>
+                    <a:blip r:embed="rId32">
+                      <a:extLst>
+                        <a:ext uri="{28A0092B-C50C-407E-A947-70E740481C1C}">
+                          <a14:useLocalDpi xmlns:a14="http://schemas.microsoft.com/office/drawing/2010/main" val="0"/>
+                        </a:ext>
+                      </a:extLst>
+                    </a:blip>
+                    <a:srcRect/>
+                    <a:stretch>
+                      <a:fillRect/>
+                    </a:stretch>
+                  </pic:blipFill>
+                  <pic:spPr bwMode="auto">
+                    <a:xfrm>
+                      <a:off x="0" y="0"/>
+                      <a:ext cx="2640330" cy="1979930"/>
+                    </a:xfrm>
+                    <a:prstGeom prst="rect">
+                      <a:avLst/>
+                    </a:prstGeom>
+                    <a:noFill/>
+                    <a:ln>
+                      <a:noFill/>
+                    </a:ln>
+                  </pic:spPr>
+                </pic:pic>
+              </a:graphicData>
+            </a:graphic>
+          </wp:anchor>
+        </w:drawing>
+      </w:r>
+      <w:r>
+        <w:t xml:space="preserve">12.2 Kernal </w:t>
+      </w:r>
+      <w:proofErr w:type="gramStart"/>
+      <w:r>
+        <w:t>( Vertical</w:t>
+      </w:r>
+      <w:proofErr w:type="gramEnd"/>
+      <w:r>
+        <w:t xml:space="preserve"> </w:t>
+      </w:r>
+      <w:proofErr w:type="gramStart"/>
+      <w:r>
+        <w:t>Detection )</w:t>
+      </w:r>
+      <w:proofErr w:type="gramEnd"/>
+      <w:r>
+        <w:t>:</w:t>
+      </w:r>
+    </w:p>
+    <w:p>
+      <w:r>
+        <w:t>-</w:t>
+      </w:r>
+      <w:proofErr w:type="gramStart"/>
+      <w:r>
+        <w:t>1  0</w:t>
+      </w:r>
+      <w:proofErr w:type="gramEnd"/>
+      <w:r>
+        <w:t xml:space="preserve">  1</w:t>
+      </w:r>
+    </w:p>
+    <w:p>
+      <w:r>
+        <w:t>-</w:t>
+      </w:r>
+      <w:proofErr w:type="gramStart"/>
+      <w:r>
+        <w:t>2  0</w:t>
+      </w:r>
+      <w:proofErr w:type="gramEnd"/>
+      <w:r>
+        <w:t xml:space="preserve">  2</w:t>
+      </w:r>
+    </w:p>
+    <w:p>
+      <w:r>
+        <w:t>-</w:t>
+      </w:r>
+      <w:proofErr w:type="gramStart"/>
+      <w:r>
+        <w:t>1  0</w:t>
+      </w:r>
+      <w:proofErr w:type="gramEnd"/>
+      <w:r>
+        <w:t xml:space="preserve">  1</w:t>
+      </w:r>
+    </w:p>
+    <w:p/>
+    <w:p>
+      <w:r>
+        <w:t xml:space="preserve">The kernel is for Vertical Detection, but the image is edging </w:t>
+      </w:r>
+      <w:proofErr w:type="gramStart"/>
+      <w:r>
+        <w:t>horizontally ,</w:t>
+      </w:r>
+      <w:proofErr w:type="gramEnd"/>
+      <w:r>
+        <w:t xml:space="preserve"> so the image predicted is black and it worked</w:t>
+      </w:r>
+      <w:r>
+        <w:t xml:space="preserve">, </w:t>
+      </w:r>
+      <w:proofErr w:type="gramStart"/>
+      <w:r>
+        <w:t>That</w:t>
+      </w:r>
+      <w:proofErr w:type="gramEnd"/>
+      <w:r>
+        <w:t xml:space="preserve"> white column in the output is due to the Vertical shadow in the left of the input image</w:t>
+      </w:r>
+    </w:p>
+    <w:p>
+      <w:pPr>
+        <w:spacing w:after="200"/>
+        <w:rPr>
+          <w:rFonts w:asciiTheme="majorBidi" w:hAnsiTheme="majorBidi" w:cstheme="majorBidi"/>
+        </w:rPr>
+      </w:pPr>
+      <w:r>
+        <w:rPr>
+          <w:noProof/>
+        </w:rPr>
+        <mc:AlternateContent>
+          <mc:Choice Requires="wps">
+            <w:drawing>
+              <wp:anchor distT="0" distB="0" distL="114300" distR="114300" simplePos="0" relativeHeight="251585536" behindDoc="1" locked="0" layoutInCell="1" allowOverlap="1" wp14:anchorId="60A3D046" wp14:editId="7BB32BA2">
+                <wp:simplePos x="0" y="0"/>
+                <wp:positionH relativeFrom="column">
+                  <wp:posOffset>4032885</wp:posOffset>
+                </wp:positionH>
+                <wp:positionV relativeFrom="paragraph">
+                  <wp:posOffset>387350</wp:posOffset>
+                </wp:positionV>
+                <wp:extent cx="2640330" cy="635"/>
+                <wp:effectExtent l="0" t="0" r="0" b="0"/>
+                <wp:wrapTight wrapText="bothSides">
+                  <wp:wrapPolygon edited="0">
+                    <wp:start x="0" y="0"/>
+                    <wp:lineTo x="0" y="21600"/>
+                    <wp:lineTo x="21600" y="21600"/>
+                    <wp:lineTo x="21600" y="0"/>
+                  </wp:wrapPolygon>
+                </wp:wrapTight>
+                <wp:docPr id="507191094" name="Text Box 1"/>
+                <wp:cNvGraphicFramePr/>
+                <a:graphic xmlns:a="http://schemas.openxmlformats.org/drawingml/2006/main">
+                  <a:graphicData uri="http://schemas.microsoft.com/office/word/2010/wordprocessingShape">
+                    <wps:wsp>
+                      <wps:cNvSpPr txBox="1"/>
+                      <wps:spPr>
+                        <a:xfrm>
+                          <a:off x="0" y="0"/>
+                          <a:ext cx="2640330" cy="635"/>
+                        </a:xfrm>
+                        <a:prstGeom prst="rect">
+                          <a:avLst/>
+                        </a:prstGeom>
+                        <a:solidFill>
+                          <a:prstClr val="white"/>
+                        </a:solidFill>
+                        <a:ln>
+                          <a:noFill/>
+                        </a:ln>
+                      </wps:spPr>
+                      <wps:txbx>
+                        <w:txbxContent>
+                          <w:p>
+                            <w:pPr>
+                              <w:pStyle w:val="Caption"/>
+                              <w:jc w:val="center"/>
+                              <w:rPr>
+                                <w:noProof/>
+                                <w:sz w:val="26"/>
+                                <w:szCs w:val="26"/>
+                              </w:rPr>
+                            </w:pPr>
+                            <w:r>
+                              <w:t xml:space="preserve">Figure </w:t>
+                            </w:r>
+                            <w:fldSimple w:instr=" SEQ Figure \* ARABIC ">
+                              <w:r>
+                                <w:rPr>
+                                  <w:noProof/>
+                                </w:rPr>
+                                <w:t>21</w:t>
+                              </w:r>
+                            </w:fldSimple>
+                            <w:r>
+                              <w:t>: Input Image</w:t>
+                            </w:r>
+                          </w:p>
+                        </w:txbxContent>
+                      </wps:txbx>
+                      <wps:bodyPr rot="0" spcFirstLastPara="0" vertOverflow="overflow" horzOverflow="overflow" vert="horz" wrap="square" lIns="0" tIns="0" rIns="0" bIns="0" numCol="1" spcCol="0" rtlCol="0" fromWordArt="0" anchor="t" anchorCtr="0" forceAA="0" compatLnSpc="1">
+                        <a:prstTxWarp prst="textNoShape">
+                          <a:avLst/>
+                        </a:prstTxWarp>
+                        <a:spAutoFit/>
+                      </wps:bodyPr>
+                    </wps:wsp>
+                  </a:graphicData>
+                </a:graphic>
+              </wp:anchor>
+            </w:drawing>
+          </mc:Choice>
+          <mc:Fallback>
+            <w:pict>
+              <v:shape w14:anchorId="60A3D046" id="_x0000_s1037" type="#_x0000_t202" style="position:absolute;margin-left:317.55pt;margin-top:30.5pt;width:207.9pt;height:.05pt;z-index:-251730944;visibility:visible;mso-wrap-style:square;mso-wrap-distance-left:9pt;mso-wrap-distance-top:0;mso-wrap-distance-right:9pt;mso-wrap-distance-bottom:0;mso-position-horizontal:absolute;mso-position-horizontal-relative:text;mso-position-vertical:absolute;mso-position-vertical-relative:text;v-text-anchor:top" o:gfxdata="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" stroked="f">
+                <v:textbox style="mso-fit-shape-to-text:t" inset="0,0,0,0">
+                  <w:txbxContent>
+                    <w:p>
+                      <w:pPr>
+                        <w:pStyle w:val="Caption"/>
+                        <w:jc w:val="center"/>
+                        <w:rPr>
+                          <w:noProof/>
+                          <w:sz w:val="26"/>
+                          <w:szCs w:val="26"/>
+                        </w:rPr>
+                      </w:pPr>
+                      <w:r>
+                        <w:t xml:space="preserve">Figure </w:t>
+                      </w:r>
+                      <w:fldSimple w:instr=" SEQ Figure \* ARABIC ">
+                        <w:r>
+                          <w:rPr>
+                            <w:noProof/>
+                          </w:rPr>
+                          <w:t>21</w:t>
+                        </w:r>
+                      </w:fldSimple>
+                      <w:r>
+                        <w:t>: Input Image</w:t>
+                      </w:r>
+                    </w:p>
+                  </w:txbxContent>
+                </v:textbox>
+                <w10:wrap type="tight"/>
+              </v:shape>
+            </w:pict>
+          </mc:Fallback>
+        </mc:AlternateContent>
+      </w:r>
+      <w:r>
+        <w:rPr>
+          <w:noProof/>
+        </w:rPr>
+        <mc:AlternateContent>
+          <mc:Choice Requires="wps">
+            <w:drawing>
+              <wp:anchor distT="0" distB="0" distL="114300" distR="114300" simplePos="0" relativeHeight="251612160" behindDoc="1" locked="0" layoutInCell="1" allowOverlap="1" wp14:anchorId="1CF2ED98" wp14:editId="4EF37A40">
+                <wp:simplePos x="0" y="0"/>
+                <wp:positionH relativeFrom="column">
+                  <wp:posOffset>1868805</wp:posOffset>
+                </wp:positionH>
+                <wp:positionV relativeFrom="paragraph">
+                  <wp:posOffset>2355850</wp:posOffset>
+                </wp:positionV>
+                <wp:extent cx="2042160" cy="635"/>
+                <wp:effectExtent l="0" t="0" r="0" b="0"/>
+                <wp:wrapNone/>
+                <wp:docPr id="1797141524" name="Text Box 1"/>
+                <wp:cNvGraphicFramePr/>
+                <a:graphic xmlns:a="http://schemas.openxmlformats.org/drawingml/2006/main">
+                  <a:graphicData uri="http://schemas.microsoft.com/office/word/2010/wordprocessingShape">
+                    <wps:wsp>
+                      <wps:cNvSpPr txBox="1"/>
+                      <wps:spPr>
+                        <a:xfrm>
+                          <a:off x="0" y="0"/>
+                          <a:ext cx="2042160" cy="635"/>
+                        </a:xfrm>
+                        <a:prstGeom prst="rect">
+                          <a:avLst/>
+                        </a:prstGeom>
+                        <a:solidFill>
+                          <a:prstClr val="white"/>
+                        </a:solidFill>
+                        <a:ln>
+                          <a:noFill/>
+                        </a:ln>
+                      </wps:spPr>
+                      <wps:txbx>
+                        <w:txbxContent>
+                          <w:p>
+                            <w:pPr>
+                              <w:pStyle w:val="Caption"/>
+                              <w:rPr>
+                                <w:rFonts w:asciiTheme="majorBidi" w:hAnsiTheme="majorBidi" w:cstheme="majorBidi"/>
+                                <w:color w:val="222633"/>
+                                <w:sz w:val="22"/>
+                                <w:szCs w:val="22"/>
+                              </w:rPr>
+                            </w:pPr>
+                            <w:r>
+                              <w:t xml:space="preserve">Figure </w:t>
+                            </w:r>
+                            <w:fldSimple w:instr=" SEQ Figure \* ARABIC ">
+                              <w:r>
+                                <w:rPr>
+                                  <w:noProof/>
+                                </w:rPr>
+                                <w:t>22</w:t>
+                              </w:r>
+                            </w:fldSimple>
+                            <w:r>
+                              <w:t>: Output Image</w:t>
+                            </w:r>
+                          </w:p>
+                        </w:txbxContent>
+                      </wps:txbx>
+                      <wps:bodyPr rot="0" spcFirstLastPara="0" vertOverflow="overflow" horzOverflow="overflow" vert="horz" wrap="square" lIns="0" tIns="0" rIns="0" bIns="0" numCol="1" spcCol="0" rtlCol="0" fromWordArt="0" anchor="t" anchorCtr="0" forceAA="0" compatLnSpc="1">
+                        <a:prstTxWarp prst="textNoShape">
+                          <a:avLst/>
+                        </a:prstTxWarp>
+                        <a:spAutoFit/>
+                      </wps:bodyPr>
+                    </wps:wsp>
+                  </a:graphicData>
+                </a:graphic>
+              </wp:anchor>
+            </w:drawing>
+          </mc:Choice>
+          <mc:Fallback>
+            <w:pict>
+              <v:shape w14:anchorId="1CF2ED98" id="_x0000_s1038" type="#_x0000_t202" style="position:absolute;margin-left:147.15pt;margin-top:185.5pt;width:160.8pt;height:.05pt;z-index:-251704320;visibility:visible;mso-wrap-style:square;mso-wrap-distance-left:9pt;mso-wrap-distance-top:0;mso-wrap-distance-right:9pt;mso-wrap-distance-bottom:0;mso-position-horizontal:absolute;mso-position-horizontal-relative:text;mso-position-vertical:absolute;mso-position-vertical-relative:text;v-text-anchor:top" o:gfxdata="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" stroked="f">
+                <v:textbox style="mso-fit-shape-to-text:t" inset="0,0,0,0">
+                  <w:txbxContent>
+                    <w:p>
+                      <w:pPr>
+                        <w:pStyle w:val="Caption"/>
+                        <w:rPr>
+                          <w:rFonts w:asciiTheme="majorBidi" w:hAnsiTheme="majorBidi" w:cstheme="majorBidi"/>
+                          <w:color w:val="222633"/>
+                          <w:sz w:val="22"/>
+                          <w:szCs w:val="22"/>
+                        </w:rPr>
+                      </w:pPr>
+                      <w:r>
+                        <w:t xml:space="preserve">Figure </w:t>
+                      </w:r>
+                      <w:fldSimple w:instr=" SEQ Figure \* ARABIC ">
+                        <w:r>
+                          <w:rPr>
+                            <w:noProof/>
+                          </w:rPr>
+                          <w:t>22</w:t>
+                        </w:r>
+                      </w:fldSimple>
+                      <w:r>
+                        <w:t>: Output Image</w:t>
+                      </w:r>
+                    </w:p>
+                  </w:txbxContent>
+                </v:textbox>
+              </v:shape>
+            </w:pict>
+          </mc:Fallback>
+        </mc:AlternateContent>
+      </w:r>
+      <w:r>
+        <w:rPr>
+          <w:rFonts w:asciiTheme="majorBidi" w:hAnsiTheme="majorBidi" w:cstheme="majorBidi"/>
+        </w:rPr>
+        <w:drawing>
+          <wp:anchor distT="0" distB="0" distL="114300" distR="114300" simplePos="0" relativeHeight="251607040" behindDoc="1" locked="0" layoutInCell="1" allowOverlap="1" wp14:anchorId="33670C78" wp14:editId="308A9143">
+            <wp:simplePos x="0" y="0"/>
+            <wp:positionH relativeFrom="column">
+              <wp:posOffset>1868805</wp:posOffset>
+            </wp:positionH>
+            <wp:positionV relativeFrom="paragraph">
+              <wp:posOffset>248285</wp:posOffset>
+            </wp:positionV>
+            <wp:extent cx="2042160" cy="2050634"/>
+            <wp:effectExtent l="0" t="0" r="0" b="6985"/>
+            <wp:wrapNone/>
+            <wp:docPr id="1875440998" name="Picture 1"/>
+            <wp:cNvGraphicFramePr>
+              <a:graphicFrameLocks xmlns:a="http://schemas.openxmlformats.org/drawingml/2006/main" noChangeAspect="1"/>
+            </wp:cNvGraphicFramePr>
+            <a:graphic xmlns:a="http://schemas.openxmlformats.org/drawingml/2006/main">
+              <a:graphicData uri="http://schemas.openxmlformats.org/drawingml/2006/picture">
+                <pic:pic xmlns:pic="http://schemas.openxmlformats.org/drawingml/2006/picture">
+                  <pic:nvPicPr>
+                    <pic:cNvPr id="1875440998" name=""/>
+                    <pic:cNvPicPr/>
+                  </pic:nvPicPr>
+                  <pic:blipFill>
+                    <a:blip r:embed="rId34"/>
+                    <a:stretch>
+                      <a:fillRect/>
+                    </a:stretch>
+                  </pic:blipFill>
+                  <pic:spPr>
+                    <a:xfrm>
+                      <a:off x="0" y="0"/>
+                      <a:ext cx="2044247" cy="2052729"/>
+                    </a:xfrm>
+                    <a:prstGeom prst="rect">
+                      <a:avLst/>
+                    </a:prstGeom>
+                  </pic:spPr>
+                </pic:pic>
+              </a:graphicData>
+            </a:graphic>
+            <wp14:sizeRelH relativeFrom="margin">
+              <wp14:pctWidth>0</wp14:pctWidth>
+            </wp14:sizeRelH>
+            <wp14:sizeRelV relativeFrom="margin">
+              <wp14:pctHeight>0</wp14:pctHeight>
+            </wp14:sizeRelV>
+          </wp:anchor>
+        </w:drawing>
+      </w:r>
+      <w:r>
+        <w:rPr>
+          <w:noProof/>
+        </w:rPr>
+        <mc:AlternateContent>
+          <mc:Choice Requires="wps">
+            <w:drawing>
+              <wp:anchor distT="0" distB="0" distL="114300" distR="114300" simplePos="0" relativeHeight="251599872" behindDoc="1" locked="0" layoutInCell="1" allowOverlap="1" wp14:anchorId="1D337563" wp14:editId="434E5E75">
+                <wp:simplePos x="0" y="0"/>
+                <wp:positionH relativeFrom="column">
+                  <wp:posOffset>-287655</wp:posOffset>
+                </wp:positionH>
+                <wp:positionV relativeFrom="paragraph">
+                  <wp:posOffset>2248535</wp:posOffset>
+                </wp:positionV>
+                <wp:extent cx="1996440" cy="635"/>
+                <wp:effectExtent l="0" t="0" r="0" b="0"/>
+                <wp:wrapNone/>
+                <wp:docPr id="1963366879" name="Text Box 1"/>
+                <wp:cNvGraphicFramePr/>
+                <a:graphic xmlns:a="http://schemas.openxmlformats.org/drawingml/2006/main">
+                  <a:graphicData uri="http://schemas.microsoft.com/office/word/2010/wordprocessingShape">
+                    <wps:wsp>
+                      <wps:cNvSpPr txBox="1"/>
+                      <wps:spPr>
+                        <a:xfrm>
+                          <a:off x="0" y="0"/>
+                          <a:ext cx="1996440" cy="635"/>
+                        </a:xfrm>
+                        <a:prstGeom prst="rect">
+                          <a:avLst/>
+                        </a:prstGeom>
+                        <a:solidFill>
+                          <a:prstClr val="white"/>
+                        </a:solidFill>
+                        <a:ln>
+                          <a:noFill/>
+                        </a:ln>
+                      </wps:spPr>
+                      <wps:txbx>
+                        <w:txbxContent>
+                          <w:p>
+                            <w:pPr>
+                              <w:pStyle w:val="Caption"/>
+                              <w:rPr>
+                                <w:rFonts w:asciiTheme="majorBidi" w:hAnsiTheme="majorBidi" w:cstheme="majorBidi"/>
+                                <w:color w:val="222633"/>
+                                <w:sz w:val="22"/>
+                                <w:szCs w:val="22"/>
+                              </w:rPr>
+                            </w:pPr>
+                            <w:r>
+                              <w:t xml:space="preserve">Figure </w:t>
+                            </w:r>
+                            <w:fldSimple w:instr=" SEQ Figure \* ARABIC ">
+                              <w:r>
+                                <w:rPr>
+                                  <w:noProof/>
+                                </w:rPr>
+                                <w:t>23</w:t>
+                              </w:r>
+                            </w:fldSimple>
+                            <w:r>
+                              <w:t>: Image 32x32 Input</w:t>
+                            </w:r>
+                          </w:p>
+                        </w:txbxContent>
+                      </wps:txbx>
+                      <wps:bodyPr rot="0" spcFirstLastPara="0" vertOverflow="overflow" horzOverflow="overflow" vert="horz" wrap="square" lIns="0" tIns="0" rIns="0" bIns="0" numCol="1" spcCol="0" rtlCol="0" fromWordArt="0" anchor="t" anchorCtr="0" forceAA="0" compatLnSpc="1">
+                        <a:prstTxWarp prst="textNoShape">
+                          <a:avLst/>
+                        </a:prstTxWarp>
+                        <a:spAutoFit/>
+                      </wps:bodyPr>
+                    </wps:wsp>
+                  </a:graphicData>
+                </a:graphic>
+              </wp:anchor>
+            </w:drawing>
+          </mc:Choice>
+          <mc:Fallback>
+            <w:pict>
+              <v:shape w14:anchorId="1D337563" id="_x0000_s1039" type="#_x0000_t202" style="position:absolute;margin-left:-22.65pt;margin-top:177.05pt;width:157.2pt;height:.05pt;z-index:-251716608;visibility:visible;mso-wrap-style:square;mso-wrap-distance-left:9pt;mso-wrap-distance-top:0;mso-wrap-distance-right:9pt;mso-wrap-distance-bottom:0;mso-position-horizontal:absolute;mso-position-horizontal-relative:text;mso-position-vertical:absolute;mso-position-vertical-relative:text;v-text-anchor:top" o:gfxdata="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" stroked="f">
+                <v:textbox style="mso-fit-shape-to-text:t" inset="0,0,0,0">
+                  <w:txbxContent>
+                    <w:p>
+                      <w:pPr>
+                        <w:pStyle w:val="Caption"/>
+                        <w:rPr>
+                          <w:rFonts w:asciiTheme="majorBidi" w:hAnsiTheme="majorBidi" w:cstheme="majorBidi"/>
+                          <w:color w:val="222633"/>
+                          <w:sz w:val="22"/>
+                          <w:szCs w:val="22"/>
+                        </w:rPr>
+                      </w:pPr>
+                      <w:r>
+                        <w:t xml:space="preserve">Figure </w:t>
+                      </w:r>
+                      <w:fldSimple w:instr=" SEQ Figure \* ARABIC ">
+                        <w:r>
+                          <w:rPr>
+                            <w:noProof/>
+                          </w:rPr>
+                          <w:t>23</w:t>
+                        </w:r>
+                      </w:fldSimple>
+                      <w:r>
+                        <w:t>: Image 32x32 Input</w:t>
+                      </w:r>
+                    </w:p>
+                  </w:txbxContent>
+                </v:textbox>
+              </v:shape>
+            </w:pict>
+          </mc:Fallback>
+        </mc:AlternateContent>
+      </w:r>
+      <w:r>
+        <w:rPr>
+          <w:rFonts w:asciiTheme="majorBidi" w:hAnsiTheme="majorBidi" w:cstheme="majorBidi"/>
+        </w:rPr>
+        <w:drawing>
+          <wp:anchor distT="0" distB="0" distL="114300" distR="114300" simplePos="0" relativeHeight="251592704" behindDoc="1" locked="0" layoutInCell="1" allowOverlap="1" wp14:anchorId="7638E98D" wp14:editId="3068E60D">
+            <wp:simplePos x="0" y="0"/>
+            <wp:positionH relativeFrom="column">
+              <wp:posOffset>-287655</wp:posOffset>
+            </wp:positionH>
+            <wp:positionV relativeFrom="paragraph">
+              <wp:posOffset>233045</wp:posOffset>
+            </wp:positionV>
+            <wp:extent cx="1996613" cy="1958510"/>
+            <wp:effectExtent l="0" t="0" r="3810" b="3810"/>
+            <wp:wrapNone/>
+            <wp:docPr id="1230597301" name="Picture 1"/>
+            <wp:cNvGraphicFramePr>
+              <a:graphicFrameLocks xmlns:a="http://schemas.openxmlformats.org/drawingml/2006/main" noChangeAspect="1"/>
+            </wp:cNvGraphicFramePr>
+            <a:graphic xmlns:a="http://schemas.openxmlformats.org/drawingml/2006/main">
+              <a:graphicData uri="http://schemas.openxmlformats.org/drawingml/2006/picture">
+                <pic:pic xmlns:pic="http://schemas.openxmlformats.org/drawingml/2006/picture">
+                  <pic:nvPicPr>
+                    <pic:cNvPr id="1230597301" name=""/>
+                    <pic:cNvPicPr/>
+                  </pic:nvPicPr>
+                  <pic:blipFill>
+                    <a:blip r:embed="rId35"/>
+                    <a:stretch>
+                      <a:fillRect/>
+                    </a:stretch>
+                  </pic:blipFill>
+                  <pic:spPr>
+                    <a:xfrm>
+                      <a:off x="0" y="0"/>
+                      <a:ext cx="1996613" cy="1958510"/>
+                    </a:xfrm>
+                    <a:prstGeom prst="rect">
+                      <a:avLst/>
+                    </a:prstGeom>
+                  </pic:spPr>
+                </pic:pic>
+              </a:graphicData>
+            </a:graphic>
+          </wp:anchor>
+        </w:drawing>
+      </w:r>
+    </w:p>
+    <w:p>
+      <w:pPr>
+        <w:spacing w:after="200"/>
+        <w:jc w:val="center"/>
+        <w:rPr>
+          <w:rFonts w:asciiTheme="majorBidi" w:hAnsiTheme="majorBidi" w:cstheme="majorBidi"/>
+        </w:rPr>
+      </w:pPr>
+      <w:r>
+        <w:rPr>
+          <w:noProof/>
+        </w:rPr>
+        <w:drawing>
+          <wp:anchor distT="0" distB="0" distL="114300" distR="114300" simplePos="0" relativeHeight="251650048" behindDoc="1" locked="0" layoutInCell="1" allowOverlap="1" wp14:anchorId="44223391" wp14:editId="6DA5CAF4">
+            <wp:simplePos x="0" y="0"/>
+            <wp:positionH relativeFrom="column">
+              <wp:posOffset>3893820</wp:posOffset>
+            </wp:positionH>
+            <wp:positionV relativeFrom="paragraph">
+              <wp:posOffset>2167890</wp:posOffset>
+            </wp:positionV>
+            <wp:extent cx="2738034" cy="1524000"/>
+            <wp:effectExtent l="0" t="0" r="5715" b="0"/>
+            <wp:wrapNone/>
+            <wp:docPr id="1835953658" name="Picture 15"/>
+            <wp:cNvGraphicFramePr>
+              <a:graphicFrameLocks xmlns:a="http://schemas.openxmlformats.org/drawingml/2006/main" noChangeAspect="1"/>
+            </wp:cNvGraphicFramePr>
+            <a:graphic xmlns:a="http://schemas.openxmlformats.org/drawingml/2006/main">
+              <a:graphicData uri="http://schemas.openxmlformats.org/drawingml/2006/picture">
+                <pic:pic xmlns:pic="http://schemas.openxmlformats.org/drawingml/2006/picture">
+                  <pic:nvPicPr>
+                    <pic:cNvPr id="0" name="Picture 8"/>
+                    <pic:cNvPicPr>
+                      <a:picLocks noChangeAspect="1" noChangeArrowheads="1"/>
+                    </pic:cNvPicPr>
+                  </pic:nvPicPr>
+                  <pic:blipFill>
+                    <a:blip r:embed="rId36">
+                      <a:extLst>
+                        <a:ext uri="{28A0092B-C50C-407E-A947-70E740481C1C}">
+                          <a14:useLocalDpi xmlns:a14="http://schemas.microsoft.com/office/drawing/2010/main" val="0"/>
+                        </a:ext>
+                      </a:extLst>
+                    </a:blip>
+                    <a:srcRect/>
+                    <a:stretch>
+                      <a:fillRect/>
+                    </a:stretch>
+                  </pic:blipFill>
+                  <pic:spPr bwMode="auto">
+                    <a:xfrm>
+                      <a:off x="0" y="0"/>
+                      <a:ext cx="2738034" cy="1524000"/>
+                    </a:xfrm>
+                    <a:prstGeom prst="rect">
+                      <a:avLst/>
+                    </a:prstGeom>
+                    <a:noFill/>
+                    <a:ln>
+                      <a:noFill/>
+                    </a:ln>
+                  </pic:spPr>
+                </pic:pic>
+              </a:graphicData>
+            </a:graphic>
+            <wp14:sizeRelH relativeFrom="margin">
+              <wp14:pctWidth>0</wp14:pctWidth>
+            </wp14:sizeRelH>
+            <wp14:sizeRelV relativeFrom="margin">
+              <wp14:pctHeight>0</wp14:pctHeight>
+            </wp14:sizeRelV>
+          </wp:anchor>
+        </w:drawing>
+      </w:r>
+      <w:r>
+        <w:rPr>
+          <w:rFonts w:asciiTheme="majorBidi" w:hAnsiTheme="majorBidi" w:cstheme="majorBidi"/>
+        </w:rPr>
+        <w:br/>
+      </w:r>
+      <w:r>
+        <w:rPr>
+          <w:rFonts w:asciiTheme="majorBidi" w:hAnsiTheme="majorBidi" w:cstheme="majorBidi"/>
+        </w:rPr>
+        <w:br/>
+      </w:r>
+      <w:r>
+        <w:rPr>
+          <w:rFonts w:asciiTheme="majorBidi" w:hAnsiTheme="majorBidi" w:cstheme="majorBidi"/>
+        </w:rPr>
+        <w:br/>
+      </w:r>
+      <w:r>
+        <w:rPr>
+          <w:rFonts w:asciiTheme="majorBidi" w:hAnsiTheme="majorBidi" w:cstheme="majorBidi"/>
+        </w:rPr>
+        <w:br/>
+      </w:r>
+      <w:r>
+        <w:rPr>
+          <w:rFonts w:asciiTheme="majorBidi" w:hAnsiTheme="majorBidi" w:cstheme="majorBidi"/>
+        </w:rPr>
+        <w:br/>
+      </w:r>
+      <w:r>
+        <w:rPr>
+          <w:rFonts w:asciiTheme="majorBidi" w:hAnsiTheme="majorBidi" w:cstheme="majorBidi"/>
+        </w:rPr>
+        <w:br/>
+      </w:r>
+      <w:r>
+        <w:rPr>
+          <w:rFonts w:asciiTheme="majorBidi" w:hAnsiTheme="majorBidi" w:cstheme="majorBidi"/>
+        </w:rPr>
+        <w:br/>
+      </w:r>
+      <w:r>
+        <w:rPr>
+          <w:rFonts w:asciiTheme="majorBidi" w:hAnsiTheme="majorBidi" w:cstheme="majorBidi"/>
+        </w:rPr>
+        <w:br/>
+      </w:r>
+      <w:r>
+        <w:rPr>
+          <w:rFonts w:asciiTheme="majorBidi" w:hAnsiTheme="majorBidi" w:cstheme="majorBidi"/>
+        </w:rPr>
+        <w:br/>
+      </w:r>
+      <w:r>
+        <w:rPr>
+          <w:rFonts w:asciiTheme="majorBidi" w:hAnsiTheme="majorBidi" w:cstheme="majorBidi"/>
+        </w:rPr>
+        <w:br/>
+      </w:r>
+      <w:r>
+        <w:rPr>
+          <w:rFonts w:asciiTheme="majorBidi" w:hAnsiTheme="majorBidi" w:cstheme="majorBidi"/>
+        </w:rPr>
+        <w:br/>
+      </w:r>
+      <w:r>
+        <w:rPr>
+          <w:rFonts w:asciiTheme="majorBidi" w:hAnsiTheme="majorBidi" w:cstheme="majorBidi"/>
+        </w:rPr>
+        <w:br/>
+      </w:r>
+      <w:r>
+        <w:rPr>
+          <w:rFonts w:asciiTheme="majorBidi" w:hAnsiTheme="majorBidi" w:cstheme="majorBidi"/>
+        </w:rPr>
+        <w:br/>
+      </w:r>
+    </w:p>
+    <w:p>
+      <w:pPr>
+        <w:pStyle w:val="Heading2"/>
+      </w:pPr>
+      <w:r>
+        <w:t xml:space="preserve">12.3 Kernel </w:t>
+      </w:r>
+      <w:proofErr w:type="gramStart"/>
+      <w:r>
+        <w:t>( Vertical</w:t>
+      </w:r>
+      <w:proofErr w:type="gramEnd"/>
+      <w:r>
+        <w:t xml:space="preserve"> </w:t>
+      </w:r>
+      <w:proofErr w:type="gramStart"/>
+      <w:r>
+        <w:t>Detection )</w:t>
+      </w:r>
+      <w:proofErr w:type="gramEnd"/>
+      <w:r>
+        <w:t>:</w:t>
+      </w:r>
+    </w:p>
+    <w:p>
+      <w:r>
+        <w:t>-</w:t>
+      </w:r>
+      <w:proofErr w:type="gramStart"/>
+      <w:r>
+        <w:t>1  0</w:t>
+      </w:r>
+      <w:proofErr w:type="gramEnd"/>
+      <w:r>
+        <w:t xml:space="preserve">  1</w:t>
+      </w:r>
+    </w:p>
+    <w:p>
+      <w:r>
+        <w:t>-</w:t>
+      </w:r>
+      <w:proofErr w:type="gramStart"/>
+      <w:r>
+        <w:t>2  0</w:t>
+      </w:r>
+      <w:proofErr w:type="gramEnd"/>
+      <w:r>
+        <w:t xml:space="preserve">  2</w:t>
+      </w:r>
+    </w:p>
+    <w:p>
+      <w:r>
+        <w:t>-</w:t>
+      </w:r>
+      <w:proofErr w:type="gramStart"/>
+      <w:r>
+        <w:t>1  0</w:t>
+      </w:r>
+      <w:proofErr w:type="gramEnd"/>
+      <w:r>
+        <w:t xml:space="preserve">  1</w:t>
+      </w:r>
+    </w:p>
+    <w:p>
+      <w:pPr>
+        <w:spacing w:after="200"/>
+        <w:rPr>
+          <w:rFonts w:asciiTheme="majorBidi" w:hAnsiTheme="majorBidi" w:cstheme="majorBidi"/>
+        </w:rPr>
+      </w:pPr>
+      <w:r>
+        <w:rPr>
+          <w:noProof/>
+        </w:rPr>
+        <mc:AlternateContent>
+          <mc:Choice Requires="wps">
+            <w:drawing>
+              <wp:anchor distT="0" distB="0" distL="114300" distR="114300" simplePos="0" relativeHeight="251699200" behindDoc="1" locked="0" layoutInCell="1" allowOverlap="1" wp14:anchorId="43C57A5F" wp14:editId="0C67ED74">
+                <wp:simplePos x="0" y="0"/>
+                <wp:positionH relativeFrom="column">
+                  <wp:posOffset>3893820</wp:posOffset>
+                </wp:positionH>
+                <wp:positionV relativeFrom="paragraph">
+                  <wp:posOffset>73025</wp:posOffset>
+                </wp:positionV>
+                <wp:extent cx="2737485" cy="635"/>
+                <wp:effectExtent l="0" t="0" r="0" b="0"/>
+                <wp:wrapNone/>
+                <wp:docPr id="1853466391" name="Text Box 1"/>
+                <wp:cNvGraphicFramePr/>
+                <a:graphic xmlns:a="http://schemas.openxmlformats.org/drawingml/2006/main">
+                  <a:graphicData uri="http://schemas.microsoft.com/office/word/2010/wordprocessingShape">
+                    <wps:wsp>
+                      <wps:cNvSpPr txBox="1"/>
+                      <wps:spPr>
+                        <a:xfrm>
+                          <a:off x="0" y="0"/>
+                          <a:ext cx="2737485" cy="635"/>
+                        </a:xfrm>
+                        <a:prstGeom prst="rect">
+                          <a:avLst/>
+                        </a:prstGeom>
+                        <a:solidFill>
+                          <a:prstClr val="white"/>
+                        </a:solidFill>
+                        <a:ln>
+                          <a:noFill/>
+                        </a:ln>
+                      </wps:spPr>
+                      <wps:txbx>
+                        <w:txbxContent>
+                          <w:p>
+                            <w:pPr>
+                              <w:pStyle w:val="Caption"/>
+                              <w:jc w:val="center"/>
+                              <w:rPr>
+                                <w:noProof/>
+                                <w:color w:val="222633"/>
+                                <w:sz w:val="22"/>
+                                <w:szCs w:val="22"/>
+                              </w:rPr>
+                            </w:pPr>
+                            <w:r>
+                              <w:t xml:space="preserve">Figure </w:t>
+                            </w:r>
+                            <w:fldSimple w:instr=" SEQ Figure \* ARABIC ">
+                              <w:r>
+                                <w:rPr>
+                                  <w:noProof/>
+                                </w:rPr>
+                                <w:t>24</w:t>
+                              </w:r>
+                            </w:fldSimple>
+                            <w:r>
+                              <w:t>: Input Image</w:t>
+                            </w:r>
+                          </w:p>
+                        </w:txbxContent>
+                      </wps:txbx>
+                      <wps:bodyPr rot="0" spcFirstLastPara="0" vertOverflow="overflow" horzOverflow="overflow" vert="horz" wrap="square" lIns="0" tIns="0" rIns="0" bIns="0" numCol="1" spcCol="0" rtlCol="0" fromWordArt="0" anchor="t" anchorCtr="0" forceAA="0" compatLnSpc="1">
+                        <a:prstTxWarp prst="textNoShape">
+                          <a:avLst/>
+                        </a:prstTxWarp>
+                        <a:spAutoFit/>
+                      </wps:bodyPr>
+                    </wps:wsp>
+                  </a:graphicData>
+                </a:graphic>
+              </wp:anchor>
+            </w:drawing>
+          </mc:Choice>
+          <mc:Fallback>
+            <w:pict>
+              <v:shape w14:anchorId="43C57A5F" id="_x0000_s1040" type="#_x0000_t202" style="position:absolute;margin-left:306.6pt;margin-top:5.75pt;width:215.55pt;height:.05pt;z-index:-251617280;visibility:visible;mso-wrap-style:square;mso-wrap-distance-left:9pt;mso-wrap-distance-top:0;mso-wrap-distance-right:9pt;mso-wrap-distance-bottom:0;mso-position-horizontal:absolute;mso-position-horizontal-relative:text;mso-position-vertical:absolute;mso-position-vertical-relative:text;v-text-anchor:top" o:gfxdata="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" stroked="f">
+                <v:textbox style="mso-fit-shape-to-text:t" inset="0,0,0,0">
+                  <w:txbxContent>
+                    <w:p>
+                      <w:pPr>
+                        <w:pStyle w:val="Caption"/>
+                        <w:jc w:val="center"/>
+                        <w:rPr>
+                          <w:noProof/>
+                          <w:color w:val="222633"/>
+                          <w:sz w:val="22"/>
+                          <w:szCs w:val="22"/>
+                        </w:rPr>
+                      </w:pPr>
+                      <w:r>
+                        <w:t xml:space="preserve">Figure </w:t>
+                      </w:r>
+                      <w:fldSimple w:instr=" SEQ Figure \* ARABIC ">
+                        <w:r>
+                          <w:rPr>
+                            <w:noProof/>
+                          </w:rPr>
+                          <w:t>24</w:t>
+                        </w:r>
+                      </w:fldSimple>
+                      <w:r>
+                        <w:t>: Input Image</w:t>
+                      </w:r>
+                    </w:p>
+                  </w:txbxContent>
+                </v:textbox>
+              </v:shape>
+            </w:pict>
+          </mc:Fallback>
+        </mc:AlternateContent>
+      </w:r>
+    </w:p>
+    <w:p>
+      <w:pPr>
+        <w:spacing w:after="200" w:line="276" w:lineRule="auto"/>
+        <w:rPr>
+          <w:rFonts w:asciiTheme="majorBidi" w:hAnsiTheme="majorBidi" w:cstheme="majorBidi"/>
+        </w:rPr>
+      </w:pPr>
+      <w:r>
+        <w:rPr>
+          <w:noProof/>
+        </w:rPr>
+        <w:drawing>
+          <wp:anchor distT="0" distB="0" distL="114300" distR="114300" simplePos="0" relativeHeight="251716608" behindDoc="1" locked="0" layoutInCell="1" allowOverlap="1" wp14:anchorId="5EBEB690" wp14:editId="0A0D2388">
+            <wp:simplePos x="0" y="0"/>
+            <wp:positionH relativeFrom="column">
+              <wp:posOffset>2828925</wp:posOffset>
+            </wp:positionH>
+            <wp:positionV relativeFrom="paragraph">
+              <wp:posOffset>6350</wp:posOffset>
+            </wp:positionV>
+            <wp:extent cx="1638300" cy="1638300"/>
+            <wp:effectExtent l="0" t="0" r="0" b="0"/>
+            <wp:wrapNone/>
+            <wp:docPr id="1773583800" name="Picture 16"/>
+            <wp:cNvGraphicFramePr>
+              <a:graphicFrameLocks xmlns:a="http://schemas.openxmlformats.org/drawingml/2006/main" noChangeAspect="1"/>
+            </wp:cNvGraphicFramePr>
+            <a:graphic xmlns:a="http://schemas.openxmlformats.org/drawingml/2006/main">
+              <a:graphicData uri="http://schemas.openxmlformats.org/drawingml/2006/picture">
+                <pic:pic xmlns:pic="http://schemas.openxmlformats.org/drawingml/2006/picture">
+                  <pic:nvPicPr>
+                    <pic:cNvPr id="0" name="Picture 10"/>
+                    <pic:cNvPicPr>
+                      <a:picLocks noChangeAspect="1" noChangeArrowheads="1"/>
+                    </pic:cNvPicPr>
+                  </pic:nvPicPr>
+                  <pic:blipFill>
+                    <a:blip r:embed="rId37">
+                      <a:extLst>
+                        <a:ext uri="{28A0092B-C50C-407E-A947-70E740481C1C}">
+                          <a14:useLocalDpi xmlns:a14="http://schemas.microsoft.com/office/drawing/2010/main" val="0"/>
+                        </a:ext>
+                      </a:extLst>
+                    </a:blip>
+                    <a:srcRect/>
+                    <a:stretch>
+                      <a:fillRect/>
+                    </a:stretch>
+                  </pic:blipFill>
+                  <pic:spPr bwMode="auto">
+                    <a:xfrm>
+                      <a:off x="0" y="0"/>
+                      <a:ext cx="1638300" cy="1638300"/>
+                    </a:xfrm>
+                    <a:prstGeom prst="rect">
+                      <a:avLst/>
+                    </a:prstGeom>
+                    <a:noFill/>
+                    <a:ln>
+                      <a:noFill/>
+                    </a:ln>
+                  </pic:spPr>
+                </pic:pic>
+              </a:graphicData>
+            </a:graphic>
+            <wp14:sizeRelH relativeFrom="margin">
+              <wp14:pctWidth>0</wp14:pctWidth>
+            </wp14:sizeRelH>
+            <wp14:sizeRelV relativeFrom="margin">
+              <wp14:pctHeight>0</wp14:pctHeight>
+            </wp14:sizeRelV>
+          </wp:anchor>
+        </w:drawing>
+      </w:r>
+      <w:r>
+        <w:rPr>
+          <w:noProof/>
+        </w:rPr>
+        <mc:AlternateContent>
+          <mc:Choice Requires="wps">
+            <w:drawing>
+              <wp:anchor distT="0" distB="0" distL="114300" distR="114300" simplePos="0" relativeHeight="251726848" behindDoc="1" locked="0" layoutInCell="1" allowOverlap="1" wp14:anchorId="6CEA1E56" wp14:editId="3518C836">
+                <wp:simplePos x="0" y="0"/>
+                <wp:positionH relativeFrom="column">
+                  <wp:posOffset>2828925</wp:posOffset>
+                </wp:positionH>
+                <wp:positionV relativeFrom="paragraph">
+                  <wp:posOffset>1701800</wp:posOffset>
+                </wp:positionV>
+                <wp:extent cx="1638300" cy="635"/>
+                <wp:effectExtent l="0" t="0" r="0" b="0"/>
+                <wp:wrapNone/>
+                <wp:docPr id="1694109045" name="Text Box 1"/>
+                <wp:cNvGraphicFramePr/>
+                <a:graphic xmlns:a="http://schemas.openxmlformats.org/drawingml/2006/main">
+                  <a:graphicData uri="http://schemas.microsoft.com/office/word/2010/wordprocessingShape">
+                    <wps:wsp>
+                      <wps:cNvSpPr txBox="1"/>
+                      <wps:spPr>
+                        <a:xfrm>
+                          <a:off x="0" y="0"/>
+                          <a:ext cx="1638300" cy="635"/>
+                        </a:xfrm>
+                        <a:prstGeom prst="rect">
+                          <a:avLst/>
+                        </a:prstGeom>
+                        <a:solidFill>
+                          <a:prstClr val="white"/>
+                        </a:solidFill>
+                        <a:ln>
+                          <a:noFill/>
+                        </a:ln>
+                      </wps:spPr>
+                      <wps:txbx>
+                        <w:txbxContent>
+                          <w:p>
+                            <w:pPr>
+                              <w:pStyle w:val="Caption"/>
+                              <w:rPr>
+                                <w:noProof/>
+                                <w:color w:val="222633"/>
+                                <w:sz w:val="22"/>
+                                <w:szCs w:val="22"/>
+                              </w:rPr>
+                            </w:pPr>
+                            <w:r>
+                              <w:t xml:space="preserve">Figure </w:t>
+                            </w:r>
+                            <w:fldSimple w:instr=" SEQ Figure \* ARABIC ">
+                              <w:r>
+                                <w:rPr>
+                                  <w:noProof/>
+                                </w:rPr>
+                                <w:t>26</w:t>
+                              </w:r>
+                            </w:fldSimple>
+                            <w:r>
+                              <w:t>: Input Image 32x32</w:t>
+                            </w:r>
+                          </w:p>
+                        </w:txbxContent>
+                      </wps:txbx>
+                      <wps:bodyPr rot="0" spcFirstLastPara="0" vertOverflow="overflow" horzOverflow="overflow" vert="horz" wrap="square" lIns="0" tIns="0" rIns="0" bIns="0" numCol="1" spcCol="0" rtlCol="0" fromWordArt="0" anchor="t" anchorCtr="0" forceAA="0" compatLnSpc="1">
+                        <a:prstTxWarp prst="textNoShape">
+                          <a:avLst/>
+                        </a:prstTxWarp>
+                        <a:spAutoFit/>
+                      </wps:bodyPr>
+                    </wps:wsp>
+                  </a:graphicData>
+                </a:graphic>
+              </wp:anchor>
+            </w:drawing>
+          </mc:Choice>
+          <mc:Fallback>
+            <w:pict>
+              <v:shape w14:anchorId="6CEA1E56" id="_x0000_s1041" type="#_x0000_t202" style="position:absolute;margin-left:222.75pt;margin-top:134pt;width:129pt;height:.05pt;z-index:-251589632;visibility:visible;mso-wrap-style:square;mso-wrap-distance-left:9pt;mso-wrap-distance-top:0;mso-wrap-distance-right:9pt;mso-wrap-distance-bottom:0;mso-position-horizontal:absolute;mso-position-horizontal-relative:text;mso-position-vertical:absolute;mso-position-vertical-relative:text;v-text-anchor:top" o:gfxdata="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" stroked="f">
+                <v:textbox style="mso-fit-shape-to-text:t" inset="0,0,0,0">
+                  <w:txbxContent>
+                    <w:p>
+                      <w:pPr>
+                        <w:pStyle w:val="Caption"/>
+                        <w:rPr>
+                          <w:noProof/>
+                          <w:color w:val="222633"/>
+                          <w:sz w:val="22"/>
+                          <w:szCs w:val="22"/>
+                        </w:rPr>
+                      </w:pPr>
+                      <w:r>
+                        <w:t xml:space="preserve">Figure </w:t>
+                      </w:r>
+                      <w:fldSimple w:instr=" SEQ Figure \* ARABIC ">
+                        <w:r>
+                          <w:rPr>
+                            <w:noProof/>
+                          </w:rPr>
+                          <w:t>26</w:t>
+                        </w:r>
+                      </w:fldSimple>
+                      <w:r>
+                        <w:t>: Input Image 32x32</w:t>
+                      </w:r>
+                    </w:p>
+                  </w:txbxContent>
+                </v:textbox>
+              </v:shape>
+            </w:pict>
+          </mc:Fallback>
+        </mc:AlternateContent>
+      </w:r>
+      <w:r>
+        <w:rPr>
+          <w:noProof/>
+        </w:rPr>
+        <w:drawing>
+          <wp:anchor distT="0" distB="0" distL="114300" distR="114300" simplePos="0" relativeHeight="251750400" behindDoc="1" locked="0" layoutInCell="1" allowOverlap="1" wp14:anchorId="494058BD" wp14:editId="12C5951D">
+            <wp:simplePos x="0" y="0"/>
+            <wp:positionH relativeFrom="column">
+              <wp:posOffset>4772025</wp:posOffset>
+            </wp:positionH>
+            <wp:positionV relativeFrom="paragraph">
+              <wp:posOffset>6350</wp:posOffset>
+            </wp:positionV>
+            <wp:extent cx="1744980" cy="1744980"/>
+            <wp:effectExtent l="0" t="0" r="7620" b="7620"/>
+            <wp:wrapNone/>
+            <wp:docPr id="861915091" name="Picture 17"/>
+            <wp:cNvGraphicFramePr>
+              <a:graphicFrameLocks xmlns:a="http://schemas.openxmlformats.org/drawingml/2006/main" noChangeAspect="1"/>
+            </wp:cNvGraphicFramePr>
+            <a:graphic xmlns:a="http://schemas.openxmlformats.org/drawingml/2006/main">
+              <a:graphicData uri="http://schemas.openxmlformats.org/drawingml/2006/picture">
+                <pic:pic xmlns:pic="http://schemas.openxmlformats.org/drawingml/2006/picture">
+                  <pic:nvPicPr>
+                    <pic:cNvPr id="0" name="Picture 12"/>
+                    <pic:cNvPicPr>
+                      <a:picLocks noChangeAspect="1" noChangeArrowheads="1"/>
+                    </pic:cNvPicPr>
+                  </pic:nvPicPr>
+                  <pic:blipFill>
+                    <a:blip r:embed="rId38">
+                      <a:extLst>
+                        <a:ext uri="{28A0092B-C50C-407E-A947-70E740481C1C}">
+                          <a14:useLocalDpi xmlns:a14="http://schemas.microsoft.com/office/drawing/2010/main" val="0"/>
+                        </a:ext>
+                      </a:extLst>
+                    </a:blip>
+                    <a:srcRect/>
+                    <a:stretch>
+                      <a:fillRect/>
+                    </a:stretch>
+                  </pic:blipFill>
+                  <pic:spPr bwMode="auto">
+                    <a:xfrm>
+                      <a:off x="0" y="0"/>
+                      <a:ext cx="1744980" cy="1744980"/>
+                    </a:xfrm>
+                    <a:prstGeom prst="rect">
+                      <a:avLst/>
+                    </a:prstGeom>
+                    <a:noFill/>
+                    <a:ln>
+                      <a:noFill/>
+                    </a:ln>
+                  </pic:spPr>
+                </pic:pic>
+              </a:graphicData>
+            </a:graphic>
+            <wp14:sizeRelH relativeFrom="margin">
+              <wp14:pctWidth>0</wp14:pctWidth>
+            </wp14:sizeRelH>
+            <wp14:sizeRelV relativeFrom="margin">
+              <wp14:pctHeight>0</wp14:pctHeight>
+            </wp14:sizeRelV>
+          </wp:anchor>
+        </w:drawing>
+      </w:r>
+      <w:r>
+        <w:rPr>
+          <w:noProof/>
+        </w:rPr>
+        <mc:AlternateContent>
+          <mc:Choice Requires="wps">
+            <w:drawing>
+              <wp:anchor distT="0" distB="0" distL="114300" distR="114300" simplePos="0" relativeHeight="251769856" behindDoc="1" locked="0" layoutInCell="1" allowOverlap="1" wp14:anchorId="1C7FB989" wp14:editId="40F636AD">
+                <wp:simplePos x="0" y="0"/>
+                <wp:positionH relativeFrom="column">
+                  <wp:posOffset>4772025</wp:posOffset>
+                </wp:positionH>
+                <wp:positionV relativeFrom="paragraph">
+                  <wp:posOffset>1808480</wp:posOffset>
+                </wp:positionV>
+                <wp:extent cx="1744980" cy="635"/>
+                <wp:effectExtent l="0" t="0" r="0" b="0"/>
+                <wp:wrapNone/>
+                <wp:docPr id="461645911" name="Text Box 1"/>
+                <wp:cNvGraphicFramePr/>
+                <a:graphic xmlns:a="http://schemas.openxmlformats.org/drawingml/2006/main">
+                  <a:graphicData uri="http://schemas.microsoft.com/office/word/2010/wordprocessingShape">
+                    <wps:wsp>
+                      <wps:cNvSpPr txBox="1"/>
+                      <wps:spPr>
+                        <a:xfrm>
+                          <a:off x="0" y="0"/>
+                          <a:ext cx="1744980" cy="635"/>
+                        </a:xfrm>
+                        <a:prstGeom prst="rect">
+                          <a:avLst/>
+                        </a:prstGeom>
+                        <a:solidFill>
+                          <a:prstClr val="white"/>
+                        </a:solidFill>
+                        <a:ln>
+                          <a:noFill/>
+                        </a:ln>
+                      </wps:spPr>
+                      <wps:txbx>
+                        <w:txbxContent>
+                          <w:p>
+                            <w:pPr>
+                              <w:pStyle w:val="Caption"/>
+                              <w:rPr>
+                                <w:noProof/>
+                                <w:color w:val="222633"/>
+                                <w:sz w:val="22"/>
+                                <w:szCs w:val="22"/>
+                              </w:rPr>
+                            </w:pPr>
+                            <w:r>
+                              <w:t xml:space="preserve">Figure </w:t>
+                            </w:r>
+                            <w:fldSimple w:instr=" SEQ Figure \* ARABIC ">
+                              <w:r>
+                                <w:rPr>
+                                  <w:noProof/>
+                                </w:rPr>
+                                <w:t>25</w:t>
+                              </w:r>
+                            </w:fldSimple>
+                            <w:r>
+                              <w:t>: Output Image 32x32</w:t>
+                            </w:r>
+                          </w:p>
+                        </w:txbxContent>
+                      </wps:txbx>
+                      <wps:bodyPr rot="0" spcFirstLastPara="0" vertOverflow="overflow" horzOverflow="overflow" vert="horz" wrap="square" lIns="0" tIns="0" rIns="0" bIns="0" numCol="1" spcCol="0" rtlCol="0" fromWordArt="0" anchor="t" anchorCtr="0" forceAA="0" compatLnSpc="1">
+                        <a:prstTxWarp prst="textNoShape">
+                          <a:avLst/>
+                        </a:prstTxWarp>
+                        <a:spAutoFit/>
+                      </wps:bodyPr>
+                    </wps:wsp>
+                  </a:graphicData>
+                </a:graphic>
+              </wp:anchor>
+            </w:drawing>
+          </mc:Choice>
+          <mc:Fallback>
+            <w:pict>
+              <v:shape w14:anchorId="1C7FB989" id="_x0000_s1042" type="#_x0000_t202" style="position:absolute;margin-left:375.75pt;margin-top:142.4pt;width:137.4pt;height:.05pt;z-index:-251546624;visibility:visible;mso-wrap-style:square;mso-wrap-distance-left:9pt;mso-wrap-distance-top:0;mso-wrap-distance-right:9pt;mso-wrap-distance-bottom:0;mso-position-horizontal:absolute;mso-position-horizontal-relative:text;mso-position-vertical:absolute;mso-position-vertical-relative:text;v-text-anchor:top" o:gfxdata="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" stroked="f">
+                <v:textbox style="mso-fit-shape-to-text:t" inset="0,0,0,0">
+                  <w:txbxContent>
+                    <w:p>
+                      <w:pPr>
+                        <w:pStyle w:val="Caption"/>
+                        <w:rPr>
+                          <w:noProof/>
+                          <w:color w:val="222633"/>
+                          <w:sz w:val="22"/>
+                          <w:szCs w:val="22"/>
+                        </w:rPr>
+                      </w:pPr>
+                      <w:r>
+                        <w:t xml:space="preserve">Figure </w:t>
+                      </w:r>
+                      <w:fldSimple w:instr=" SEQ Figure \* ARABIC ">
+                        <w:r>
+                          <w:rPr>
+                            <w:noProof/>
+                          </w:rPr>
+                          <w:t>25</w:t>
+                        </w:r>
+                      </w:fldSimple>
+                      <w:r>
+                        <w:t>: Output Image 32x32</w:t>
+                      </w:r>
+                    </w:p>
+                  </w:txbxContent>
+                </v:textbox>
+              </v:shape>
+            </w:pict>
+          </mc:Fallback>
+        </mc:AlternateContent>
+      </w:r>
+      <w:r>
+        <w:rPr>
+          <w:rFonts w:asciiTheme="majorBidi" w:hAnsiTheme="majorBidi" w:cstheme="majorBidi"/>
+        </w:rPr>
+        <w:t>The image has vertical borders, so it should</w:t>
+      </w:r>
+      <w:r>
+        <w:rPr>
+          <w:rFonts w:asciiTheme="majorBidi" w:hAnsiTheme="majorBidi" w:cstheme="majorBidi"/>
+        </w:rPr>
+        <w:br/>
+        <w:t>provide output image with border detection</w:t>
+      </w:r>
+      <w:r>
+        <w:rPr>
+          <w:rFonts w:asciiTheme="majorBidi" w:hAnsiTheme="majorBidi" w:cstheme="majorBidi"/>
+        </w:rPr>
+        <w:br/>
+        <w:t xml:space="preserve">and it </w:t>
+      </w:r>
+      <w:proofErr w:type="gramStart"/>
+      <w:r>
+        <w:rPr>
+          <w:rFonts w:asciiTheme="majorBidi" w:hAnsiTheme="majorBidi" w:cstheme="majorBidi"/>
+        </w:rPr>
+        <w:t>actually succeeded</w:t>
+      </w:r>
+      <w:proofErr w:type="gramEnd"/>
+      <w:r>
+        <w:rPr>
+          <w:rFonts w:asciiTheme="majorBidi" w:hAnsiTheme="majorBidi" w:cstheme="majorBidi"/>
+        </w:rPr>
+        <w:t xml:space="preserve"> as you can see in the</w:t>
+      </w:r>
+      <w:r>
+        <w:rPr>
+          <w:rFonts w:asciiTheme="majorBidi" w:hAnsiTheme="majorBidi" w:cstheme="majorBidi"/>
+        </w:rPr>
+        <w:br/>
+        <w:t>output image as shown.</w:t>
+      </w:r>
+      <w:r>
+        <w:rPr>
+          <w:rFonts w:asciiTheme="majorBidi" w:hAnsiTheme="majorBidi" w:cstheme="majorBidi"/>
+        </w:rPr>
+        <w:br w:type="page"/>
       </w:r>
     </w:p>
     <w:p>
@@ -9750,7 +11231,7 @@
                           <pic:cNvPicPr/>
                         </pic:nvPicPr>
                         <pic:blipFill>
-                          <a:blip r:embed="rId34"/>
+                          <a:blip r:embed="rId39"/>
                           <a:stretch>
                             <a:fillRect/>
                           </a:stretch>
@@ -9783,7 +11264,7 @@
                 <w:rPr>
                   <w:noProof/>
                 </w:rPr>
-                <w:t>21</w:t>
+                <w:t>27</w:t>
               </w:r>
             </w:fldSimple>
             <w:r>
@@ -9843,7 +11324,7 @@
                           <pic:cNvPicPr/>
                         </pic:nvPicPr>
                         <pic:blipFill>
-                          <a:blip r:embed="rId35"/>
+                          <a:blip r:embed="rId40"/>
                           <a:stretch>
                             <a:fillRect/>
                           </a:stretch>
@@ -9881,7 +11362,7 @@
                 <w:rPr>
                   <w:noProof/>
                 </w:rPr>
-                <w:t>22</w:t>
+                <w:t>28</w:t>
               </w:r>
             </w:fldSimple>
             <w:r>
@@ -10952,12 +12433,14 @@
       <w:pPr>
         <w:pStyle w:val="Heading1"/>
       </w:pPr>
-      <w:bookmarkStart w:id="12" w:name="sec_team"/>
+      <w:bookmarkStart w:id="13" w:name="sec_team"/>
+      <w:bookmarkStart w:id="14" w:name="_13._Team_and"/>
+      <w:bookmarkEnd w:id="14"/>
       <w:r>
         <w:lastRenderedPageBreak/>
         <w:t>13. Team and Repository</w:t>
       </w:r>
-      <w:bookmarkEnd w:id="12"/>
+      <w:bookmarkEnd w:id="13"/>
     </w:p>
     <w:p>
       <w:pPr>
@@ -11158,7 +12641,7 @@
         </w:rPr>
         <w:t xml:space="preserve">Repository: </w:t>
       </w:r>
-      <w:hyperlink r:id="rId36">
+      <w:hyperlink r:id="rId41">
         <w:r>
           <w:rPr>
             <w:rFonts w:asciiTheme="majorBidi" w:hAnsiTheme="majorBidi" w:cstheme="majorBidi"/>
@@ -11226,7 +12709,7 @@
           <w:szCs w:val="28"/>
         </w:rPr>
       </w:pPr>
-      <w:bookmarkStart w:id="13" w:name="sec_reqtable"/>
+      <w:bookmarkStart w:id="15" w:name="sec_reqtable"/>
       <w:r>
         <w:br w:type="page"/>
       </w:r>
@@ -11235,11 +12718,13 @@
       <w:pPr>
         <w:pStyle w:val="Heading1"/>
       </w:pPr>
+      <w:bookmarkStart w:id="16" w:name="_14._Competition_Required"/>
+      <w:bookmarkEnd w:id="16"/>
       <w:r>
         <w:lastRenderedPageBreak/>
         <w:t>14. Competition Required Results Table</w:t>
       </w:r>
-      <w:bookmarkEnd w:id="13"/>
+      <w:bookmarkEnd w:id="15"/>
     </w:p>
     <w:p>
       <w:pPr>
@@ -12767,8 +14252,8 @@
       </w:pPr>
     </w:p>
     <w:sectPr>
-      <w:headerReference w:type="default" r:id="rId37"/>
-      <w:footerReference w:type="default" r:id="rId38"/>
+      <w:headerReference w:type="default" r:id="rId42"/>
+      <w:footerReference w:type="default" r:id="rId43"/>
       <w:pgSz w:w="12240" w:h="15840"/>
       <w:pgMar w:top="879" w:right="1077" w:bottom="850" w:left="1077" w:header="720" w:footer="720" w:gutter="0"/>
       <w:pgBorders w:display="notFirstPage" w:offsetFrom="page">
@@ -13074,7 +14559,7 @@
         </mc:Choice>
         <mc:Fallback>
           <w:pict>
-            <v:rect w14:anchorId="358ADCCD" id="Rectangle 200" o:spid="_x0000_s1037" style="position:absolute;margin-left:-28.35pt;margin-top:26.25pt;width:561pt;height:36.75pt;z-index:-251658240;visibility:visible;mso-wrap-style:square;mso-width-percent:0;mso-height-percent:0;mso-wrap-distance-left:9.35pt;mso-wrap-distance-top:0;mso-wrap-distance-right:9.35pt;mso-wrap-distance-bottom:0;mso-position-horizontal:absolute;mso-position-horizontal-relative:margin;mso-position-vertical:absolute;mso-position-vertical-relative:page;mso-width-percent:0;mso-height-percent:0;mso-width-relative:margin;mso-height-relative:page;v-text-anchor:middle" o:gfxdata="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" o:allowoverlap="f" fillcolor="#4f81bd [3204]" stroked="f" strokeweight="2pt">
+            <v:rect w14:anchorId="358ADCCD" id="Rectangle 200" o:spid="_x0000_s1043" style="position:absolute;margin-left:-28.35pt;margin-top:26.25pt;width:561pt;height:36.75pt;z-index:-251658240;visibility:visible;mso-wrap-style:square;mso-width-percent:0;mso-height-percent:0;mso-wrap-distance-left:9.35pt;mso-wrap-distance-top:0;mso-wrap-distance-right:9.35pt;mso-wrap-distance-bottom:0;mso-position-horizontal:absolute;mso-position-horizontal-relative:margin;mso-position-vertical:absolute;mso-position-vertical-relative:page;mso-width-percent:0;mso-height-percent:0;mso-width-relative:margin;mso-height-relative:page;v-text-anchor:middle" o:gfxdata="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" o:allowoverlap="f" fillcolor="#4f81bd [3204]" stroked="f" strokeweight="2pt">
               <v:textbox>
                 <w:txbxContent>
                   <w:sdt>
@@ -14060,7 +15545,7 @@
   <w:style w:type="paragraph" w:default="1" w:styleId="Normal">
     <w:name w:val="Normal"/>
     <w:qFormat/>
-    <w:rsid w:val="008A0104"/>
+    <w:rsid w:val="00EF1B3C"/>
     <w:pPr>
       <w:spacing w:after="120" w:line="269" w:lineRule="auto"/>
     </w:pPr>
@@ -14281,7 +15766,6 @@
   <w:style w:type="character" w:default="1" w:styleId="DefaultParagraphFont">
     <w:name w:val="Default Paragraph Font"/>
     <w:uiPriority w:val="1"/>
-    <w:semiHidden/>
     <w:unhideWhenUsed/>
   </w:style>
   <w:style w:type="table" w:default="1" w:styleId="TableNormal">

</xml_diff>